<commit_message>
Add code transformation preview section to DOCX report
Section 8 shows 5 before/after FORTRAN modernization examples:
1. GOTO spaghetti → structured IF/THEN/ELSE
2. COMMON block global state → module encapsulation
3. EQUIVALENCE memory aliasing → proper typed variables
4. Arithmetic IF / computed GOTO → SELECT CASE
5. Fixed-format + implicit typing → free-format with allocatable arrays

Each example has red (before) and green (after) color-coded code blocks
with monospace formatting. Designed as a client showcase for enterprise
sales conversations.

Co-Authored-By: Claude Opus 4.6 (1M context) <noreply@anthropic.com>
</commit_message>
<xml_diff>
--- a/reports/NASTRAN-93-Code-Review.docx
+++ b/reports/NASTRAN-93-Code-Review.docx
@@ -9876,6 +9876,3993 @@
         </w:rPr>
         <w:t xml:space="preserve">Validate modernized modules against the NASTRAN Verification Problem Manual.</w:t>
       </w:r>
+    </w:p>
+    <w:p>
+      <w:r>
+        <w:br w:type="page"/>
+      </w:r>
+    </w:p>
+    <w:p>
+      <w:pPr>
+        <w:pStyle w:val="Heading1"/>
+      </w:pPr>
+      <w:r>
+        <w:t xml:space="preserve">8. Code Transformation Preview</w:t>
+      </w:r>
+    </w:p>
+    <w:p>
+      <w:pPr>
+        <w:spacing w:after="200"/>
+      </w:pPr>
+      <w:r>
+        <w:rPr>
+          <w:rFonts w:ascii="Calibri" w:cs="Calibri" w:eastAsia="Calibri" w:hAnsi="Calibri"/>
+          <w:color w:val="1E293B"/>
+          <w:sz w:val="22"/>
+          <w:szCs w:val="22"/>
+        </w:rPr>
+        <w:t xml:space="preserve">The following examples demonstrate the type of transformations Hulde Review recommends. Each example shows the original legacy FORTRAN pattern alongside the modernized equivalent. These are representative of the changes that would be applied across the 1,728 files during migration.</w:t>
+      </w:r>
+    </w:p>
+    <w:p>
+      <w:pPr>
+        <w:pStyle w:val="Heading2"/>
+      </w:pPr>
+      <w:r>
+        <w:t xml:space="preserve">Example 1: GOTO Spaghetti Code → Structured Control Flow</w:t>
+      </w:r>
+    </w:p>
+    <w:p>
+      <w:pPr>
+        <w:spacing w:after="160"/>
+      </w:pPr>
+      <w:r>
+        <w:rPr>
+          <w:rFonts w:ascii="Calibri" w:cs="Calibri" w:eastAsia="Calibri" w:hAnsi="Calibri"/>
+          <w:i/>
+          <w:iCs/>
+          <w:color w:val="1E293B"/>
+          <w:sz w:val="20"/>
+          <w:szCs w:val="20"/>
+        </w:rPr>
+        <w:t xml:space="preserve">Eliminates unstructured jumps with proper IF/THEN/ELSE blocks. Reduces cyclomatic complexity and makes the logic traceable.</w:t>
+      </w:r>
+    </w:p>
+    <w:tbl>
+      <w:tblPr>
+        <w:tblW w:type="dxa" w:w="9360"/>
+        <w:tblBorders>
+          <w:top w:val="single" w:color="auto" w:sz="4"/>
+          <w:left w:val="single" w:color="auto" w:sz="4"/>
+          <w:bottom w:val="single" w:color="auto" w:sz="4"/>
+          <w:right w:val="single" w:color="auto" w:sz="4"/>
+          <w:insideH w:val="single" w:color="auto" w:sz="4"/>
+          <w:insideV w:val="single" w:color="auto" w:sz="4"/>
+        </w:tblBorders>
+      </w:tblPr>
+      <w:tblGrid>
+        <w:gridCol w:w="9360"/>
+      </w:tblGrid>
+      <w:tr>
+        <w:tc>
+          <w:tcPr>
+            <w:tcW w:type="dxa" w:w="9360"/>
+            <w:tcBorders>
+              <w:top w:val="single" w:color="E2E8F0" w:sz="1"/>
+              <w:left w:val="single" w:color="E2E8F0" w:sz="1"/>
+              <w:bottom w:val="none" w:color="FFFFFF" w:sz="0"/>
+              <w:right w:val="single" w:color="E2E8F0" w:sz="1"/>
+            </w:tcBorders>
+            <w:shd w:fill="DC2626" w:val="clear"/>
+            <w:tcMar>
+              <w:top w:type="dxa" w:w="40"/>
+              <w:left w:type="dxa" w:w="120"/>
+              <w:bottom w:type="dxa" w:w="40"/>
+              <w:right w:type="dxa" w:w="120"/>
+            </w:tcMar>
+          </w:tcPr>
+          <w:p>
+            <w:r>
+              <w:rPr>
+                <w:rFonts w:ascii="Calibri" w:cs="Calibri" w:eastAsia="Calibri" w:hAnsi="Calibri"/>
+                <w:b/>
+                <w:bCs/>
+                <w:color w:val="FFFFFF"/>
+                <w:sz w:val="16"/>
+                <w:szCs w:val="16"/>
+              </w:rPr>
+              <w:t xml:space="preserve">✖  BEFORE — Legacy FORTRAN</w:t>
+            </w:r>
+          </w:p>
+        </w:tc>
+      </w:tr>
+    </w:tbl>
+    <w:tbl>
+      <w:tblPr>
+        <w:tblW w:type="dxa" w:w="9360"/>
+        <w:tblBorders>
+          <w:top w:val="single" w:color="auto" w:sz="4"/>
+          <w:left w:val="single" w:color="auto" w:sz="4"/>
+          <w:bottom w:val="single" w:color="auto" w:sz="4"/>
+          <w:right w:val="single" w:color="auto" w:sz="4"/>
+          <w:insideH w:val="single" w:color="auto" w:sz="4"/>
+          <w:insideV w:val="single" w:color="auto" w:sz="4"/>
+        </w:tblBorders>
+      </w:tblPr>
+      <w:tblGrid>
+        <w:gridCol w:w="9360"/>
+      </w:tblGrid>
+      <w:tr>
+        <w:tc>
+          <w:tcPr>
+            <w:tcW w:type="dxa" w:w="9360"/>
+            <w:tcBorders>
+              <w:top w:val="none" w:color="FFFFFF" w:sz="0"/>
+              <w:left w:val="single" w:color="E2E8F0" w:sz="1"/>
+              <w:bottom w:val="single" w:color="E2E8F0" w:sz="1"/>
+              <w:right w:val="single" w:color="E2E8F0" w:sz="1"/>
+            </w:tcBorders>
+            <w:shd w:fill="FFF5F5" w:val="clear"/>
+            <w:tcMar>
+              <w:top w:type="dxa" w:w="80"/>
+              <w:left w:type="dxa" w:w="160"/>
+              <w:bottom w:type="dxa" w:w="80"/>
+              <w:right w:type="dxa" w:w="160"/>
+            </w:tcMar>
+          </w:tcPr>
+          <w:p>
+            <w:pPr>
+              <w:spacing w:after="0" w:before="0" w:line="260"/>
+            </w:pPr>
+            <w:r>
+              <w:rPr>
+                <w:rFonts w:ascii="Courier New" w:cs="Courier New" w:eastAsia="Courier New" w:hAnsi="Courier New"/>
+                <w:color w:val="1E293B"/>
+                <w:sz w:val="15"/>
+                <w:szCs w:val="15"/>
+              </w:rPr>
+              <w:t xml:space="preserve">      SUBROUTINE SOLVE(A, B, N, IERR)</w:t>
+            </w:r>
+          </w:p>
+          <w:p>
+            <w:pPr>
+              <w:spacing w:after="0" w:before="0" w:line="260"/>
+            </w:pPr>
+            <w:r>
+              <w:rPr>
+                <w:rFonts w:ascii="Courier New" w:cs="Courier New" w:eastAsia="Courier New" w:hAnsi="Courier New"/>
+                <w:color w:val="1E293B"/>
+                <w:sz w:val="15"/>
+                <w:szCs w:val="15"/>
+              </w:rPr>
+              <w:t xml:space="preserve">      IMPLICIT NONE</w:t>
+            </w:r>
+          </w:p>
+          <w:p>
+            <w:pPr>
+              <w:spacing w:after="0" w:before="0" w:line="260"/>
+            </w:pPr>
+            <w:r>
+              <w:rPr>
+                <w:rFonts w:ascii="Courier New" w:cs="Courier New" w:eastAsia="Courier New" w:hAnsi="Courier New"/>
+                <w:color w:val="1E293B"/>
+                <w:sz w:val="15"/>
+                <w:szCs w:val="15"/>
+              </w:rPr>
+              <w:t xml:space="preserve">      INTEGER N, IERR, I</w:t>
+            </w:r>
+          </w:p>
+          <w:p>
+            <w:pPr>
+              <w:spacing w:after="0" w:before="0" w:line="260"/>
+            </w:pPr>
+            <w:r>
+              <w:rPr>
+                <w:rFonts w:ascii="Courier New" w:cs="Courier New" w:eastAsia="Courier New" w:hAnsi="Courier New"/>
+                <w:color w:val="1E293B"/>
+                <w:sz w:val="15"/>
+                <w:szCs w:val="15"/>
+              </w:rPr>
+              <w:t xml:space="preserve">      REAL A(N,N), B(N)</w:t>
+            </w:r>
+          </w:p>
+          <w:p>
+            <w:pPr>
+              <w:spacing w:after="0" w:before="0" w:line="260"/>
+            </w:pPr>
+            <w:r>
+              <w:rPr>
+                <w:rFonts w:ascii="Courier New" w:cs="Courier New" w:eastAsia="Courier New" w:hAnsi="Courier New"/>
+                <w:color w:val="1E293B"/>
+                <w:sz w:val="15"/>
+                <w:szCs w:val="15"/>
+              </w:rPr>
+              <w:t xml:space="preserve">      IERR = 0</w:t>
+            </w:r>
+          </w:p>
+          <w:p>
+            <w:pPr>
+              <w:spacing w:after="0" w:before="0" w:line="260"/>
+            </w:pPr>
+            <w:r>
+              <w:rPr>
+                <w:rFonts w:ascii="Courier New" w:cs="Courier New" w:eastAsia="Courier New" w:hAnsi="Courier New"/>
+                <w:color w:val="1E293B"/>
+                <w:sz w:val="15"/>
+                <w:szCs w:val="15"/>
+              </w:rPr>
+              <w:t xml:space="preserve">      DO 100 I = 1, N</w:t>
+            </w:r>
+          </w:p>
+          <w:p>
+            <w:pPr>
+              <w:spacing w:after="0" w:before="0" w:line="260"/>
+            </w:pPr>
+            <w:r>
+              <w:rPr>
+                <w:rFonts w:ascii="Courier New" w:cs="Courier New" w:eastAsia="Courier New" w:hAnsi="Courier New"/>
+                <w:color w:val="1E293B"/>
+                <w:sz w:val="15"/>
+                <w:szCs w:val="15"/>
+              </w:rPr>
+              <w:t xml:space="preserve">        IF (A(I,I) .EQ. 0.0) GOTO 999</w:t>
+            </w:r>
+          </w:p>
+          <w:p>
+            <w:pPr>
+              <w:spacing w:after="0" w:before="0" w:line="260"/>
+            </w:pPr>
+            <w:r>
+              <w:rPr>
+                <w:rFonts w:ascii="Courier New" w:cs="Courier New" w:eastAsia="Courier New" w:hAnsi="Courier New"/>
+                <w:color w:val="1E293B"/>
+                <w:sz w:val="15"/>
+                <w:szCs w:val="15"/>
+              </w:rPr>
+              <w:t xml:space="preserve">        B(I) = B(I) / A(I,I)</w:t>
+            </w:r>
+          </w:p>
+          <w:p>
+            <w:pPr>
+              <w:spacing w:after="0" w:before="0" w:line="260"/>
+            </w:pPr>
+            <w:r>
+              <w:rPr>
+                <w:rFonts w:ascii="Courier New" w:cs="Courier New" w:eastAsia="Courier New" w:hAnsi="Courier New"/>
+                <w:color w:val="1E293B"/>
+                <w:sz w:val="15"/>
+                <w:szCs w:val="15"/>
+              </w:rPr>
+              <w:t xml:space="preserve">  100 CONTINUE</w:t>
+            </w:r>
+          </w:p>
+          <w:p>
+            <w:pPr>
+              <w:spacing w:after="0" w:before="0" w:line="260"/>
+            </w:pPr>
+            <w:r>
+              <w:rPr>
+                <w:rFonts w:ascii="Courier New" w:cs="Courier New" w:eastAsia="Courier New" w:hAnsi="Courier New"/>
+                <w:color w:val="1E293B"/>
+                <w:sz w:val="15"/>
+                <w:szCs w:val="15"/>
+              </w:rPr>
+              <w:t xml:space="preserve">      RETURN</w:t>
+            </w:r>
+          </w:p>
+          <w:p>
+            <w:pPr>
+              <w:spacing w:after="0" w:before="0" w:line="260"/>
+            </w:pPr>
+            <w:r>
+              <w:rPr>
+                <w:rFonts w:ascii="Courier New" w:cs="Courier New" w:eastAsia="Courier New" w:hAnsi="Courier New"/>
+                <w:color w:val="1E293B"/>
+                <w:sz w:val="15"/>
+                <w:szCs w:val="15"/>
+              </w:rPr>
+              <w:t xml:space="preserve">  999 IERR = -1</w:t>
+            </w:r>
+          </w:p>
+          <w:p>
+            <w:pPr>
+              <w:spacing w:after="0" w:before="0" w:line="260"/>
+            </w:pPr>
+            <w:r>
+              <w:rPr>
+                <w:rFonts w:ascii="Courier New" w:cs="Courier New" w:eastAsia="Courier New" w:hAnsi="Courier New"/>
+                <w:color w:val="1E293B"/>
+                <w:sz w:val="15"/>
+                <w:szCs w:val="15"/>
+              </w:rPr>
+              <w:t xml:space="preserve">      WRITE(6,*) 'SINGULAR MATRIX'</w:t>
+            </w:r>
+          </w:p>
+          <w:p>
+            <w:pPr>
+              <w:spacing w:after="0" w:before="0" w:line="260"/>
+            </w:pPr>
+            <w:r>
+              <w:rPr>
+                <w:rFonts w:ascii="Courier New" w:cs="Courier New" w:eastAsia="Courier New" w:hAnsi="Courier New"/>
+                <w:color w:val="1E293B"/>
+                <w:sz w:val="15"/>
+                <w:szCs w:val="15"/>
+              </w:rPr>
+              <w:t xml:space="preserve">      GOTO 100</w:t>
+            </w:r>
+          </w:p>
+          <w:p>
+            <w:pPr>
+              <w:spacing w:after="0" w:before="0" w:line="260"/>
+            </w:pPr>
+            <w:r>
+              <w:rPr>
+                <w:rFonts w:ascii="Courier New" w:cs="Courier New" w:eastAsia="Courier New" w:hAnsi="Courier New"/>
+                <w:color w:val="1E293B"/>
+                <w:sz w:val="15"/>
+                <w:szCs w:val="15"/>
+              </w:rPr>
+              <w:t xml:space="preserve">      END</w:t>
+            </w:r>
+          </w:p>
+        </w:tc>
+      </w:tr>
+    </w:tbl>
+    <w:p>
+      <w:pPr>
+        <w:spacing w:before="120"/>
+      </w:pPr>
+    </w:p>
+    <w:tbl>
+      <w:tblPr>
+        <w:tblW w:type="dxa" w:w="9360"/>
+        <w:tblBorders>
+          <w:top w:val="single" w:color="auto" w:sz="4"/>
+          <w:left w:val="single" w:color="auto" w:sz="4"/>
+          <w:bottom w:val="single" w:color="auto" w:sz="4"/>
+          <w:right w:val="single" w:color="auto" w:sz="4"/>
+          <w:insideH w:val="single" w:color="auto" w:sz="4"/>
+          <w:insideV w:val="single" w:color="auto" w:sz="4"/>
+        </w:tblBorders>
+      </w:tblPr>
+      <w:tblGrid>
+        <w:gridCol w:w="9360"/>
+      </w:tblGrid>
+      <w:tr>
+        <w:tc>
+          <w:tcPr>
+            <w:tcW w:type="dxa" w:w="9360"/>
+            <w:tcBorders>
+              <w:top w:val="single" w:color="E2E8F0" w:sz="1"/>
+              <w:left w:val="single" w:color="E2E8F0" w:sz="1"/>
+              <w:bottom w:val="none" w:color="FFFFFF" w:sz="0"/>
+              <w:right w:val="single" w:color="E2E8F0" w:sz="1"/>
+            </w:tcBorders>
+            <w:shd w:fill="00A651" w:val="clear"/>
+            <w:tcMar>
+              <w:top w:type="dxa" w:w="40"/>
+              <w:left w:type="dxa" w:w="120"/>
+              <w:bottom w:type="dxa" w:w="40"/>
+              <w:right w:type="dxa" w:w="120"/>
+            </w:tcMar>
+          </w:tcPr>
+          <w:p>
+            <w:r>
+              <w:rPr>
+                <w:rFonts w:ascii="Calibri" w:cs="Calibri" w:eastAsia="Calibri" w:hAnsi="Calibri"/>
+                <w:b/>
+                <w:bCs/>
+                <w:color w:val="FFFFFF"/>
+                <w:sz w:val="16"/>
+                <w:szCs w:val="16"/>
+              </w:rPr>
+              <w:t xml:space="preserve">✔  AFTER — Modern Fortran 2018</w:t>
+            </w:r>
+          </w:p>
+        </w:tc>
+      </w:tr>
+    </w:tbl>
+    <w:tbl>
+      <w:tblPr>
+        <w:tblW w:type="dxa" w:w="9360"/>
+        <w:tblBorders>
+          <w:top w:val="single" w:color="auto" w:sz="4"/>
+          <w:left w:val="single" w:color="auto" w:sz="4"/>
+          <w:bottom w:val="single" w:color="auto" w:sz="4"/>
+          <w:right w:val="single" w:color="auto" w:sz="4"/>
+          <w:insideH w:val="single" w:color="auto" w:sz="4"/>
+          <w:insideV w:val="single" w:color="auto" w:sz="4"/>
+        </w:tblBorders>
+      </w:tblPr>
+      <w:tblGrid>
+        <w:gridCol w:w="9360"/>
+      </w:tblGrid>
+      <w:tr>
+        <w:tc>
+          <w:tcPr>
+            <w:tcW w:type="dxa" w:w="9360"/>
+            <w:tcBorders>
+              <w:top w:val="none" w:color="FFFFFF" w:sz="0"/>
+              <w:left w:val="single" w:color="E2E8F0" w:sz="1"/>
+              <w:bottom w:val="single" w:color="E2E8F0" w:sz="1"/>
+              <w:right w:val="single" w:color="E2E8F0" w:sz="1"/>
+            </w:tcBorders>
+            <w:shd w:fill="F0FFF4" w:val="clear"/>
+            <w:tcMar>
+              <w:top w:type="dxa" w:w="80"/>
+              <w:left w:type="dxa" w:w="160"/>
+              <w:bottom w:type="dxa" w:w="80"/>
+              <w:right w:type="dxa" w:w="160"/>
+            </w:tcMar>
+          </w:tcPr>
+          <w:p>
+            <w:pPr>
+              <w:spacing w:after="0" w:before="0" w:line="260"/>
+            </w:pPr>
+            <w:r>
+              <w:rPr>
+                <w:rFonts w:ascii="Courier New" w:cs="Courier New" w:eastAsia="Courier New" w:hAnsi="Courier New"/>
+                <w:color w:val="1E293B"/>
+                <w:sz w:val="15"/>
+                <w:szCs w:val="15"/>
+              </w:rPr>
+              <w:t xml:space="preserve">module linear_solver</w:t>
+            </w:r>
+          </w:p>
+          <w:p>
+            <w:pPr>
+              <w:spacing w:after="0" w:before="0" w:line="260"/>
+            </w:pPr>
+            <w:r>
+              <w:rPr>
+                <w:rFonts w:ascii="Courier New" w:cs="Courier New" w:eastAsia="Courier New" w:hAnsi="Courier New"/>
+                <w:color w:val="1E293B"/>
+                <w:sz w:val="15"/>
+                <w:szCs w:val="15"/>
+              </w:rPr>
+              <w:t xml:space="preserve">  implicit none</w:t>
+            </w:r>
+          </w:p>
+          <w:p>
+            <w:pPr>
+              <w:spacing w:after="0" w:before="0" w:line="260"/>
+            </w:pPr>
+            <w:r>
+              <w:rPr>
+                <w:rFonts w:ascii="Courier New" w:cs="Courier New" w:eastAsia="Courier New" w:hAnsi="Courier New"/>
+                <w:color w:val="1E293B"/>
+                <w:sz w:val="15"/>
+                <w:szCs w:val="15"/>
+              </w:rPr>
+              <w:t xml:space="preserve">contains</w:t>
+            </w:r>
+          </w:p>
+          <w:p>
+            <w:pPr>
+              <w:spacing w:after="0" w:before="0" w:line="260"/>
+            </w:pPr>
+            <w:r>
+              <w:rPr>
+                <w:rFonts w:ascii="Courier New" w:cs="Courier New" w:eastAsia="Courier New" w:hAnsi="Courier New"/>
+                <w:color w:val="1E293B"/>
+                <w:sz w:val="15"/>
+                <w:szCs w:val="15"/>
+              </w:rPr>
+              <w:t xml:space="preserve">  subroutine solve(A, B, n, ierr)</w:t>
+            </w:r>
+          </w:p>
+          <w:p>
+            <w:pPr>
+              <w:spacing w:after="0" w:before="0" w:line="260"/>
+            </w:pPr>
+            <w:r>
+              <w:rPr>
+                <w:rFonts w:ascii="Courier New" w:cs="Courier New" w:eastAsia="Courier New" w:hAnsi="Courier New"/>
+                <w:color w:val="1E293B"/>
+                <w:sz w:val="15"/>
+                <w:szCs w:val="15"/>
+              </w:rPr>
+              <w:t xml:space="preserve">    integer, intent(in)    :: n</w:t>
+            </w:r>
+          </w:p>
+          <w:p>
+            <w:pPr>
+              <w:spacing w:after="0" w:before="0" w:line="260"/>
+            </w:pPr>
+            <w:r>
+              <w:rPr>
+                <w:rFonts w:ascii="Courier New" w:cs="Courier New" w:eastAsia="Courier New" w:hAnsi="Courier New"/>
+                <w:color w:val="1E293B"/>
+                <w:sz w:val="15"/>
+                <w:szCs w:val="15"/>
+              </w:rPr>
+              <w:t xml:space="preserve">    real,    intent(inout)  :: A(n,n), B(n)</w:t>
+            </w:r>
+          </w:p>
+          <w:p>
+            <w:pPr>
+              <w:spacing w:after="0" w:before="0" w:line="260"/>
+            </w:pPr>
+            <w:r>
+              <w:rPr>
+                <w:rFonts w:ascii="Courier New" w:cs="Courier New" w:eastAsia="Courier New" w:hAnsi="Courier New"/>
+                <w:color w:val="1E293B"/>
+                <w:sz w:val="15"/>
+                <w:szCs w:val="15"/>
+              </w:rPr>
+              <w:t xml:space="preserve">    integer, intent(out)   :: ierr</w:t>
+            </w:r>
+          </w:p>
+          <w:p>
+            <w:pPr>
+              <w:spacing w:after="0" w:before="0" w:line="260"/>
+            </w:pPr>
+            <w:r>
+              <w:rPr>
+                <w:rFonts w:ascii="Courier New" w:cs="Courier New" w:eastAsia="Courier New" w:hAnsi="Courier New"/>
+                <w:color w:val="1E293B"/>
+                <w:sz w:val="15"/>
+                <w:szCs w:val="15"/>
+              </w:rPr>
+              <w:t xml:space="preserve">    integer :: i</w:t>
+            </w:r>
+          </w:p>
+          <w:p>
+            <w:pPr>
+              <w:spacing w:after="0" w:before="0" w:line="260"/>
+            </w:pPr>
+            <w:r>
+              <w:rPr>
+                <w:rFonts w:ascii="Courier New" w:cs="Courier New" w:eastAsia="Courier New" w:hAnsi="Courier New"/>
+                <w:color w:val="1E293B"/>
+                <w:sz w:val="15"/>
+                <w:szCs w:val="15"/>
+              </w:rPr>
+              <w:t xml:space="preserve"> </w:t>
+            </w:r>
+          </w:p>
+          <w:p>
+            <w:pPr>
+              <w:spacing w:after="0" w:before="0" w:line="260"/>
+            </w:pPr>
+            <w:r>
+              <w:rPr>
+                <w:rFonts w:ascii="Courier New" w:cs="Courier New" w:eastAsia="Courier New" w:hAnsi="Courier New"/>
+                <w:color w:val="1E293B"/>
+                <w:sz w:val="15"/>
+                <w:szCs w:val="15"/>
+              </w:rPr>
+              <w:t xml:space="preserve">    ierr = 0</w:t>
+            </w:r>
+          </w:p>
+          <w:p>
+            <w:pPr>
+              <w:spacing w:after="0" w:before="0" w:line="260"/>
+            </w:pPr>
+            <w:r>
+              <w:rPr>
+                <w:rFonts w:ascii="Courier New" w:cs="Courier New" w:eastAsia="Courier New" w:hAnsi="Courier New"/>
+                <w:color w:val="1E293B"/>
+                <w:sz w:val="15"/>
+                <w:szCs w:val="15"/>
+              </w:rPr>
+              <w:t xml:space="preserve">    do i = 1, n</w:t>
+            </w:r>
+          </w:p>
+          <w:p>
+            <w:pPr>
+              <w:spacing w:after="0" w:before="0" w:line="260"/>
+            </w:pPr>
+            <w:r>
+              <w:rPr>
+                <w:rFonts w:ascii="Courier New" w:cs="Courier New" w:eastAsia="Courier New" w:hAnsi="Courier New"/>
+                <w:color w:val="1E293B"/>
+                <w:sz w:val="15"/>
+                <w:szCs w:val="15"/>
+              </w:rPr>
+              <w:t xml:space="preserve">      if (A(i,i) == 0.0) then</w:t>
+            </w:r>
+          </w:p>
+          <w:p>
+            <w:pPr>
+              <w:spacing w:after="0" w:before="0" w:line="260"/>
+            </w:pPr>
+            <w:r>
+              <w:rPr>
+                <w:rFonts w:ascii="Courier New" w:cs="Courier New" w:eastAsia="Courier New" w:hAnsi="Courier New"/>
+                <w:color w:val="1E293B"/>
+                <w:sz w:val="15"/>
+                <w:szCs w:val="15"/>
+              </w:rPr>
+              <w:t xml:space="preserve">        ierr = -1</w:t>
+            </w:r>
+          </w:p>
+          <w:p>
+            <w:pPr>
+              <w:spacing w:after="0" w:before="0" w:line="260"/>
+            </w:pPr>
+            <w:r>
+              <w:rPr>
+                <w:rFonts w:ascii="Courier New" w:cs="Courier New" w:eastAsia="Courier New" w:hAnsi="Courier New"/>
+                <w:color w:val="1E293B"/>
+                <w:sz w:val="15"/>
+                <w:szCs w:val="15"/>
+              </w:rPr>
+              <w:t xml:space="preserve">        write(*,*) 'Error: singular matrix at row', i</w:t>
+            </w:r>
+          </w:p>
+          <w:p>
+            <w:pPr>
+              <w:spacing w:after="0" w:before="0" w:line="260"/>
+            </w:pPr>
+            <w:r>
+              <w:rPr>
+                <w:rFonts w:ascii="Courier New" w:cs="Courier New" w:eastAsia="Courier New" w:hAnsi="Courier New"/>
+                <w:color w:val="1E293B"/>
+                <w:sz w:val="15"/>
+                <w:szCs w:val="15"/>
+              </w:rPr>
+              <w:t xml:space="preserve">        return</w:t>
+            </w:r>
+          </w:p>
+          <w:p>
+            <w:pPr>
+              <w:spacing w:after="0" w:before="0" w:line="260"/>
+            </w:pPr>
+            <w:r>
+              <w:rPr>
+                <w:rFonts w:ascii="Courier New" w:cs="Courier New" w:eastAsia="Courier New" w:hAnsi="Courier New"/>
+                <w:color w:val="1E293B"/>
+                <w:sz w:val="15"/>
+                <w:szCs w:val="15"/>
+              </w:rPr>
+              <w:t xml:space="preserve">      end if</w:t>
+            </w:r>
+          </w:p>
+          <w:p>
+            <w:pPr>
+              <w:spacing w:after="0" w:before="0" w:line="260"/>
+            </w:pPr>
+            <w:r>
+              <w:rPr>
+                <w:rFonts w:ascii="Courier New" w:cs="Courier New" w:eastAsia="Courier New" w:hAnsi="Courier New"/>
+                <w:color w:val="1E293B"/>
+                <w:sz w:val="15"/>
+                <w:szCs w:val="15"/>
+              </w:rPr>
+              <w:t xml:space="preserve">      B(i) = B(i) / A(i,i)</w:t>
+            </w:r>
+          </w:p>
+          <w:p>
+            <w:pPr>
+              <w:spacing w:after="0" w:before="0" w:line="260"/>
+            </w:pPr>
+            <w:r>
+              <w:rPr>
+                <w:rFonts w:ascii="Courier New" w:cs="Courier New" w:eastAsia="Courier New" w:hAnsi="Courier New"/>
+                <w:color w:val="1E293B"/>
+                <w:sz w:val="15"/>
+                <w:szCs w:val="15"/>
+              </w:rPr>
+              <w:t xml:space="preserve">    end do</w:t>
+            </w:r>
+          </w:p>
+          <w:p>
+            <w:pPr>
+              <w:spacing w:after="0" w:before="0" w:line="260"/>
+            </w:pPr>
+            <w:r>
+              <w:rPr>
+                <w:rFonts w:ascii="Courier New" w:cs="Courier New" w:eastAsia="Courier New" w:hAnsi="Courier New"/>
+                <w:color w:val="1E293B"/>
+                <w:sz w:val="15"/>
+                <w:szCs w:val="15"/>
+              </w:rPr>
+              <w:t xml:space="preserve">  end subroutine solve</w:t>
+            </w:r>
+          </w:p>
+          <w:p>
+            <w:pPr>
+              <w:spacing w:after="0" w:before="0" w:line="260"/>
+            </w:pPr>
+            <w:r>
+              <w:rPr>
+                <w:rFonts w:ascii="Courier New" w:cs="Courier New" w:eastAsia="Courier New" w:hAnsi="Courier New"/>
+                <w:color w:val="1E293B"/>
+                <w:sz w:val="15"/>
+                <w:szCs w:val="15"/>
+              </w:rPr>
+              <w:t xml:space="preserve">end module linear_solver</w:t>
+            </w:r>
+          </w:p>
+        </w:tc>
+      </w:tr>
+    </w:tbl>
+    <w:p>
+      <w:pPr>
+        <w:spacing w:before="240"/>
+      </w:pPr>
+    </w:p>
+    <w:p>
+      <w:pPr>
+        <w:pStyle w:val="Heading2"/>
+      </w:pPr>
+      <w:r>
+        <w:t xml:space="preserve">Example 2: COMMON Block Global State → Module Encapsulation</w:t>
+      </w:r>
+    </w:p>
+    <w:p>
+      <w:pPr>
+        <w:spacing w:after="160"/>
+      </w:pPr>
+      <w:r>
+        <w:rPr>
+          <w:rFonts w:ascii="Calibri" w:cs="Calibri" w:eastAsia="Calibri" w:hAnsi="Calibri"/>
+          <w:i/>
+          <w:iCs/>
+          <w:color w:val="1E293B"/>
+          <w:sz w:val="20"/>
+          <w:szCs w:val="20"/>
+        </w:rPr>
+        <w:t xml:space="preserve">Replaces unprotected shared memory with typed module variables and explicit INTENT attributes, preventing unintended side effects.</w:t>
+      </w:r>
+    </w:p>
+    <w:tbl>
+      <w:tblPr>
+        <w:tblW w:type="dxa" w:w="9360"/>
+        <w:tblBorders>
+          <w:top w:val="single" w:color="auto" w:sz="4"/>
+          <w:left w:val="single" w:color="auto" w:sz="4"/>
+          <w:bottom w:val="single" w:color="auto" w:sz="4"/>
+          <w:right w:val="single" w:color="auto" w:sz="4"/>
+          <w:insideH w:val="single" w:color="auto" w:sz="4"/>
+          <w:insideV w:val="single" w:color="auto" w:sz="4"/>
+        </w:tblBorders>
+      </w:tblPr>
+      <w:tblGrid>
+        <w:gridCol w:w="9360"/>
+      </w:tblGrid>
+      <w:tr>
+        <w:tc>
+          <w:tcPr>
+            <w:tcW w:type="dxa" w:w="9360"/>
+            <w:tcBorders>
+              <w:top w:val="single" w:color="E2E8F0" w:sz="1"/>
+              <w:left w:val="single" w:color="E2E8F0" w:sz="1"/>
+              <w:bottom w:val="none" w:color="FFFFFF" w:sz="0"/>
+              <w:right w:val="single" w:color="E2E8F0" w:sz="1"/>
+            </w:tcBorders>
+            <w:shd w:fill="DC2626" w:val="clear"/>
+            <w:tcMar>
+              <w:top w:type="dxa" w:w="40"/>
+              <w:left w:type="dxa" w:w="120"/>
+              <w:bottom w:type="dxa" w:w="40"/>
+              <w:right w:type="dxa" w:w="120"/>
+            </w:tcMar>
+          </w:tcPr>
+          <w:p>
+            <w:r>
+              <w:rPr>
+                <w:rFonts w:ascii="Calibri" w:cs="Calibri" w:eastAsia="Calibri" w:hAnsi="Calibri"/>
+                <w:b/>
+                <w:bCs/>
+                <w:color w:val="FFFFFF"/>
+                <w:sz w:val="16"/>
+                <w:szCs w:val="16"/>
+              </w:rPr>
+              <w:t xml:space="preserve">✖  BEFORE — Legacy FORTRAN</w:t>
+            </w:r>
+          </w:p>
+        </w:tc>
+      </w:tr>
+    </w:tbl>
+    <w:tbl>
+      <w:tblPr>
+        <w:tblW w:type="dxa" w:w="9360"/>
+        <w:tblBorders>
+          <w:top w:val="single" w:color="auto" w:sz="4"/>
+          <w:left w:val="single" w:color="auto" w:sz="4"/>
+          <w:bottom w:val="single" w:color="auto" w:sz="4"/>
+          <w:right w:val="single" w:color="auto" w:sz="4"/>
+          <w:insideH w:val="single" w:color="auto" w:sz="4"/>
+          <w:insideV w:val="single" w:color="auto" w:sz="4"/>
+        </w:tblBorders>
+      </w:tblPr>
+      <w:tblGrid>
+        <w:gridCol w:w="9360"/>
+      </w:tblGrid>
+      <w:tr>
+        <w:tc>
+          <w:tcPr>
+            <w:tcW w:type="dxa" w:w="9360"/>
+            <w:tcBorders>
+              <w:top w:val="none" w:color="FFFFFF" w:sz="0"/>
+              <w:left w:val="single" w:color="E2E8F0" w:sz="1"/>
+              <w:bottom w:val="single" w:color="E2E8F0" w:sz="1"/>
+              <w:right w:val="single" w:color="E2E8F0" w:sz="1"/>
+            </w:tcBorders>
+            <w:shd w:fill="FFF5F5" w:val="clear"/>
+            <w:tcMar>
+              <w:top w:type="dxa" w:w="80"/>
+              <w:left w:type="dxa" w:w="160"/>
+              <w:bottom w:type="dxa" w:w="80"/>
+              <w:right w:type="dxa" w:w="160"/>
+            </w:tcMar>
+          </w:tcPr>
+          <w:p>
+            <w:pPr>
+              <w:spacing w:after="0" w:before="0" w:line="260"/>
+            </w:pPr>
+            <w:r>
+              <w:rPr>
+                <w:rFonts w:ascii="Courier New" w:cs="Courier New" w:eastAsia="Courier New" w:hAnsi="Courier New"/>
+                <w:color w:val="1E293B"/>
+                <w:sz w:val="15"/>
+                <w:szCs w:val="15"/>
+              </w:rPr>
+              <w:t xml:space="preserve">C     GLOBAL DATA VIA COMMON BLOCKS</w:t>
+            </w:r>
+          </w:p>
+          <w:p>
+            <w:pPr>
+              <w:spacing w:after="0" w:before="0" w:line="260"/>
+            </w:pPr>
+            <w:r>
+              <w:rPr>
+                <w:rFonts w:ascii="Courier New" w:cs="Courier New" w:eastAsia="Courier New" w:hAnsi="Courier New"/>
+                <w:color w:val="1E293B"/>
+                <w:sz w:val="15"/>
+                <w:szCs w:val="15"/>
+              </w:rPr>
+              <w:t xml:space="preserve">      COMMON /MACHIN/ MACH, IDYN, KCORE</w:t>
+            </w:r>
+          </w:p>
+          <w:p>
+            <w:pPr>
+              <w:spacing w:after="0" w:before="0" w:line="260"/>
+            </w:pPr>
+            <w:r>
+              <w:rPr>
+                <w:rFonts w:ascii="Courier New" w:cs="Courier New" w:eastAsia="Courier New" w:hAnsi="Courier New"/>
+                <w:color w:val="1E293B"/>
+                <w:sz w:val="15"/>
+                <w:szCs w:val="15"/>
+              </w:rPr>
+              <w:t xml:space="preserve">      COMMON /SYSTEM/ IBUF, NOUT, NOGO</w:t>
+            </w:r>
+          </w:p>
+          <w:p>
+            <w:pPr>
+              <w:spacing w:after="0" w:before="0" w:line="260"/>
+            </w:pPr>
+            <w:r>
+              <w:rPr>
+                <w:rFonts w:ascii="Courier New" w:cs="Courier New" w:eastAsia="Courier New" w:hAnsi="Courier New"/>
+                <w:color w:val="1E293B"/>
+                <w:sz w:val="15"/>
+                <w:szCs w:val="15"/>
+              </w:rPr>
+              <w:t xml:space="preserve">      COMMON /NAMES/ RD, RDREW, WRT, WRTREW</w:t>
+            </w:r>
+          </w:p>
+          <w:p>
+            <w:pPr>
+              <w:spacing w:after="0" w:before="0" w:line="260"/>
+            </w:pPr>
+            <w:r>
+              <w:rPr>
+                <w:rFonts w:ascii="Courier New" w:cs="Courier New" w:eastAsia="Courier New" w:hAnsi="Courier New"/>
+                <w:color w:val="1E293B"/>
+                <w:sz w:val="15"/>
+                <w:szCs w:val="15"/>
+              </w:rPr>
+              <w:t xml:space="preserve">      INTEGER MACH, IDYN, KCORE</w:t>
+            </w:r>
+          </w:p>
+          <w:p>
+            <w:pPr>
+              <w:spacing w:after="0" w:before="0" w:line="260"/>
+            </w:pPr>
+            <w:r>
+              <w:rPr>
+                <w:rFonts w:ascii="Courier New" w:cs="Courier New" w:eastAsia="Courier New" w:hAnsi="Courier New"/>
+                <w:color w:val="1E293B"/>
+                <w:sz w:val="15"/>
+                <w:szCs w:val="15"/>
+              </w:rPr>
+              <w:t xml:space="preserve">      INTEGER IBUF, NOUT, NOGO</w:t>
+            </w:r>
+          </w:p>
+          <w:p>
+            <w:pPr>
+              <w:spacing w:after="0" w:before="0" w:line="260"/>
+            </w:pPr>
+            <w:r>
+              <w:rPr>
+                <w:rFonts w:ascii="Courier New" w:cs="Courier New" w:eastAsia="Courier New" w:hAnsi="Courier New"/>
+                <w:color w:val="1E293B"/>
+                <w:sz w:val="15"/>
+                <w:szCs w:val="15"/>
+              </w:rPr>
+              <w:t xml:space="preserve">      INTEGER RD, RDREW, WRT, WRTREW</w:t>
+            </w:r>
+          </w:p>
+          <w:p>
+            <w:pPr>
+              <w:spacing w:after="0" w:before="0" w:line="260"/>
+            </w:pPr>
+            <w:r>
+              <w:rPr>
+                <w:rFonts w:ascii="Courier New" w:cs="Courier New" w:eastAsia="Courier New" w:hAnsi="Courier New"/>
+                <w:color w:val="1E293B"/>
+                <w:sz w:val="15"/>
+                <w:szCs w:val="15"/>
+              </w:rPr>
+              <w:t xml:space="preserve"> </w:t>
+            </w:r>
+          </w:p>
+          <w:p>
+            <w:pPr>
+              <w:spacing w:after="0" w:before="0" w:line="260"/>
+            </w:pPr>
+            <w:r>
+              <w:rPr>
+                <w:rFonts w:ascii="Courier New" w:cs="Courier New" w:eastAsia="Courier New" w:hAnsi="Courier New"/>
+                <w:color w:val="1E293B"/>
+                <w:sz w:val="15"/>
+                <w:szCs w:val="15"/>
+              </w:rPr>
+              <w:t xml:space="preserve">      SUBROUTINE XREAD(BUF, NWORDS)</w:t>
+            </w:r>
+          </w:p>
+          <w:p>
+            <w:pPr>
+              <w:spacing w:after="0" w:before="0" w:line="260"/>
+            </w:pPr>
+            <w:r>
+              <w:rPr>
+                <w:rFonts w:ascii="Courier New" w:cs="Courier New" w:eastAsia="Courier New" w:hAnsi="Courier New"/>
+                <w:color w:val="1E293B"/>
+                <w:sz w:val="15"/>
+                <w:szCs w:val="15"/>
+              </w:rPr>
+              <w:t xml:space="preserve">      COMMON /MACHIN/ MACH, IDYN, KCORE</w:t>
+            </w:r>
+          </w:p>
+          <w:p>
+            <w:pPr>
+              <w:spacing w:after="0" w:before="0" w:line="260"/>
+            </w:pPr>
+            <w:r>
+              <w:rPr>
+                <w:rFonts w:ascii="Courier New" w:cs="Courier New" w:eastAsia="Courier New" w:hAnsi="Courier New"/>
+                <w:color w:val="1E293B"/>
+                <w:sz w:val="15"/>
+                <w:szCs w:val="15"/>
+              </w:rPr>
+              <w:t xml:space="preserve">      COMMON /SYSTEM/ IBUF, NOUT, NOGO</w:t>
+            </w:r>
+          </w:p>
+          <w:p>
+            <w:pPr>
+              <w:spacing w:after="0" w:before="0" w:line="260"/>
+            </w:pPr>
+            <w:r>
+              <w:rPr>
+                <w:rFonts w:ascii="Courier New" w:cs="Courier New" w:eastAsia="Courier New" w:hAnsi="Courier New"/>
+                <w:color w:val="1E293B"/>
+                <w:sz w:val="15"/>
+                <w:szCs w:val="15"/>
+              </w:rPr>
+              <w:t xml:space="preserve">      NOGO = 0</w:t>
+            </w:r>
+          </w:p>
+          <w:p>
+            <w:pPr>
+              <w:spacing w:after="0" w:before="0" w:line="260"/>
+            </w:pPr>
+            <w:r>
+              <w:rPr>
+                <w:rFonts w:ascii="Courier New" w:cs="Courier New" w:eastAsia="Courier New" w:hAnsi="Courier New"/>
+                <w:color w:val="1E293B"/>
+                <w:sz w:val="15"/>
+                <w:szCs w:val="15"/>
+              </w:rPr>
+              <w:t xml:space="preserve">      IF (IBUF .LE. 0) NOGO = -1</w:t>
+            </w:r>
+          </w:p>
+          <w:p>
+            <w:pPr>
+              <w:spacing w:after="0" w:before="0" w:line="260"/>
+            </w:pPr>
+            <w:r>
+              <w:rPr>
+                <w:rFonts w:ascii="Courier New" w:cs="Courier New" w:eastAsia="Courier New" w:hAnsi="Courier New"/>
+                <w:color w:val="1E293B"/>
+                <w:sz w:val="15"/>
+                <w:szCs w:val="15"/>
+              </w:rPr>
+              <w:t xml:space="preserve">      END</w:t>
+            </w:r>
+          </w:p>
+        </w:tc>
+      </w:tr>
+    </w:tbl>
+    <w:p>
+      <w:pPr>
+        <w:spacing w:before="120"/>
+      </w:pPr>
+    </w:p>
+    <w:tbl>
+      <w:tblPr>
+        <w:tblW w:type="dxa" w:w="9360"/>
+        <w:tblBorders>
+          <w:top w:val="single" w:color="auto" w:sz="4"/>
+          <w:left w:val="single" w:color="auto" w:sz="4"/>
+          <w:bottom w:val="single" w:color="auto" w:sz="4"/>
+          <w:right w:val="single" w:color="auto" w:sz="4"/>
+          <w:insideH w:val="single" w:color="auto" w:sz="4"/>
+          <w:insideV w:val="single" w:color="auto" w:sz="4"/>
+        </w:tblBorders>
+      </w:tblPr>
+      <w:tblGrid>
+        <w:gridCol w:w="9360"/>
+      </w:tblGrid>
+      <w:tr>
+        <w:tc>
+          <w:tcPr>
+            <w:tcW w:type="dxa" w:w="9360"/>
+            <w:tcBorders>
+              <w:top w:val="single" w:color="E2E8F0" w:sz="1"/>
+              <w:left w:val="single" w:color="E2E8F0" w:sz="1"/>
+              <w:bottom w:val="none" w:color="FFFFFF" w:sz="0"/>
+              <w:right w:val="single" w:color="E2E8F0" w:sz="1"/>
+            </w:tcBorders>
+            <w:shd w:fill="00A651" w:val="clear"/>
+            <w:tcMar>
+              <w:top w:type="dxa" w:w="40"/>
+              <w:left w:type="dxa" w:w="120"/>
+              <w:bottom w:type="dxa" w:w="40"/>
+              <w:right w:type="dxa" w:w="120"/>
+            </w:tcMar>
+          </w:tcPr>
+          <w:p>
+            <w:r>
+              <w:rPr>
+                <w:rFonts w:ascii="Calibri" w:cs="Calibri" w:eastAsia="Calibri" w:hAnsi="Calibri"/>
+                <w:b/>
+                <w:bCs/>
+                <w:color w:val="FFFFFF"/>
+                <w:sz w:val="16"/>
+                <w:szCs w:val="16"/>
+              </w:rPr>
+              <w:t xml:space="preserve">✔  AFTER — Modern Fortran 2018</w:t>
+            </w:r>
+          </w:p>
+        </w:tc>
+      </w:tr>
+    </w:tbl>
+    <w:tbl>
+      <w:tblPr>
+        <w:tblW w:type="dxa" w:w="9360"/>
+        <w:tblBorders>
+          <w:top w:val="single" w:color="auto" w:sz="4"/>
+          <w:left w:val="single" w:color="auto" w:sz="4"/>
+          <w:bottom w:val="single" w:color="auto" w:sz="4"/>
+          <w:right w:val="single" w:color="auto" w:sz="4"/>
+          <w:insideH w:val="single" w:color="auto" w:sz="4"/>
+          <w:insideV w:val="single" w:color="auto" w:sz="4"/>
+        </w:tblBorders>
+      </w:tblPr>
+      <w:tblGrid>
+        <w:gridCol w:w="9360"/>
+      </w:tblGrid>
+      <w:tr>
+        <w:tc>
+          <w:tcPr>
+            <w:tcW w:type="dxa" w:w="9360"/>
+            <w:tcBorders>
+              <w:top w:val="none" w:color="FFFFFF" w:sz="0"/>
+              <w:left w:val="single" w:color="E2E8F0" w:sz="1"/>
+              <w:bottom w:val="single" w:color="E2E8F0" w:sz="1"/>
+              <w:right w:val="single" w:color="E2E8F0" w:sz="1"/>
+            </w:tcBorders>
+            <w:shd w:fill="F0FFF4" w:val="clear"/>
+            <w:tcMar>
+              <w:top w:type="dxa" w:w="80"/>
+              <w:left w:type="dxa" w:w="160"/>
+              <w:bottom w:type="dxa" w:w="80"/>
+              <w:right w:type="dxa" w:w="160"/>
+            </w:tcMar>
+          </w:tcPr>
+          <w:p>
+            <w:pPr>
+              <w:spacing w:after="0" w:before="0" w:line="260"/>
+            </w:pPr>
+            <w:r>
+              <w:rPr>
+                <w:rFonts w:ascii="Courier New" w:cs="Courier New" w:eastAsia="Courier New" w:hAnsi="Courier New"/>
+                <w:color w:val="1E293B"/>
+                <w:sz w:val="15"/>
+                <w:szCs w:val="15"/>
+              </w:rPr>
+              <w:t xml:space="preserve">module machine_config</w:t>
+            </w:r>
+          </w:p>
+          <w:p>
+            <w:pPr>
+              <w:spacing w:after="0" w:before="0" w:line="260"/>
+            </w:pPr>
+            <w:r>
+              <w:rPr>
+                <w:rFonts w:ascii="Courier New" w:cs="Courier New" w:eastAsia="Courier New" w:hAnsi="Courier New"/>
+                <w:color w:val="1E293B"/>
+                <w:sz w:val="15"/>
+                <w:szCs w:val="15"/>
+              </w:rPr>
+              <w:t xml:space="preserve">  implicit none</w:t>
+            </w:r>
+          </w:p>
+          <w:p>
+            <w:pPr>
+              <w:spacing w:after="0" w:before="0" w:line="260"/>
+            </w:pPr>
+            <w:r>
+              <w:rPr>
+                <w:rFonts w:ascii="Courier New" w:cs="Courier New" w:eastAsia="Courier New" w:hAnsi="Courier New"/>
+                <w:color w:val="1E293B"/>
+                <w:sz w:val="15"/>
+                <w:szCs w:val="15"/>
+              </w:rPr>
+              <w:t xml:space="preserve">  private</w:t>
+            </w:r>
+          </w:p>
+          <w:p>
+            <w:pPr>
+              <w:spacing w:after="0" w:before="0" w:line="260"/>
+            </w:pPr>
+            <w:r>
+              <w:rPr>
+                <w:rFonts w:ascii="Courier New" w:cs="Courier New" w:eastAsia="Courier New" w:hAnsi="Courier New"/>
+                <w:color w:val="1E293B"/>
+                <w:sz w:val="15"/>
+                <w:szCs w:val="15"/>
+              </w:rPr>
+              <w:t xml:space="preserve">  integer, public, protected :: mach  = 0</w:t>
+            </w:r>
+          </w:p>
+          <w:p>
+            <w:pPr>
+              <w:spacing w:after="0" w:before="0" w:line="260"/>
+            </w:pPr>
+            <w:r>
+              <w:rPr>
+                <w:rFonts w:ascii="Courier New" w:cs="Courier New" w:eastAsia="Courier New" w:hAnsi="Courier New"/>
+                <w:color w:val="1E293B"/>
+                <w:sz w:val="15"/>
+                <w:szCs w:val="15"/>
+              </w:rPr>
+              <w:t xml:space="preserve">  integer, public, protected :: idyn  = 0</w:t>
+            </w:r>
+          </w:p>
+          <w:p>
+            <w:pPr>
+              <w:spacing w:after="0" w:before="0" w:line="260"/>
+            </w:pPr>
+            <w:r>
+              <w:rPr>
+                <w:rFonts w:ascii="Courier New" w:cs="Courier New" w:eastAsia="Courier New" w:hAnsi="Courier New"/>
+                <w:color w:val="1E293B"/>
+                <w:sz w:val="15"/>
+                <w:szCs w:val="15"/>
+              </w:rPr>
+              <w:t xml:space="preserve">  integer, public, protected :: kcore = 0</w:t>
+            </w:r>
+          </w:p>
+          <w:p>
+            <w:pPr>
+              <w:spacing w:after="0" w:before="0" w:line="260"/>
+            </w:pPr>
+            <w:r>
+              <w:rPr>
+                <w:rFonts w:ascii="Courier New" w:cs="Courier New" w:eastAsia="Courier New" w:hAnsi="Courier New"/>
+                <w:color w:val="1E293B"/>
+                <w:sz w:val="15"/>
+                <w:szCs w:val="15"/>
+              </w:rPr>
+              <w:t xml:space="preserve">  public :: init_machine</w:t>
+            </w:r>
+          </w:p>
+          <w:p>
+            <w:pPr>
+              <w:spacing w:after="0" w:before="0" w:line="260"/>
+            </w:pPr>
+            <w:r>
+              <w:rPr>
+                <w:rFonts w:ascii="Courier New" w:cs="Courier New" w:eastAsia="Courier New" w:hAnsi="Courier New"/>
+                <w:color w:val="1E293B"/>
+                <w:sz w:val="15"/>
+                <w:szCs w:val="15"/>
+              </w:rPr>
+              <w:t xml:space="preserve">contains</w:t>
+            </w:r>
+          </w:p>
+          <w:p>
+            <w:pPr>
+              <w:spacing w:after="0" w:before="0" w:line="260"/>
+            </w:pPr>
+            <w:r>
+              <w:rPr>
+                <w:rFonts w:ascii="Courier New" w:cs="Courier New" w:eastAsia="Courier New" w:hAnsi="Courier New"/>
+                <w:color w:val="1E293B"/>
+                <w:sz w:val="15"/>
+                <w:szCs w:val="15"/>
+              </w:rPr>
+              <w:t xml:space="preserve">  subroutine init_machine(m, d, k)</w:t>
+            </w:r>
+          </w:p>
+          <w:p>
+            <w:pPr>
+              <w:spacing w:after="0" w:before="0" w:line="260"/>
+            </w:pPr>
+            <w:r>
+              <w:rPr>
+                <w:rFonts w:ascii="Courier New" w:cs="Courier New" w:eastAsia="Courier New" w:hAnsi="Courier New"/>
+                <w:color w:val="1E293B"/>
+                <w:sz w:val="15"/>
+                <w:szCs w:val="15"/>
+              </w:rPr>
+              <w:t xml:space="preserve">    integer, intent(in) :: m, d, k</w:t>
+            </w:r>
+          </w:p>
+          <w:p>
+            <w:pPr>
+              <w:spacing w:after="0" w:before="0" w:line="260"/>
+            </w:pPr>
+            <w:r>
+              <w:rPr>
+                <w:rFonts w:ascii="Courier New" w:cs="Courier New" w:eastAsia="Courier New" w:hAnsi="Courier New"/>
+                <w:color w:val="1E293B"/>
+                <w:sz w:val="15"/>
+                <w:szCs w:val="15"/>
+              </w:rPr>
+              <w:t xml:space="preserve">    mach = m; idyn = d; kcore = k</w:t>
+            </w:r>
+          </w:p>
+          <w:p>
+            <w:pPr>
+              <w:spacing w:after="0" w:before="0" w:line="260"/>
+            </w:pPr>
+            <w:r>
+              <w:rPr>
+                <w:rFonts w:ascii="Courier New" w:cs="Courier New" w:eastAsia="Courier New" w:hAnsi="Courier New"/>
+                <w:color w:val="1E293B"/>
+                <w:sz w:val="15"/>
+                <w:szCs w:val="15"/>
+              </w:rPr>
+              <w:t xml:space="preserve">  end subroutine</w:t>
+            </w:r>
+          </w:p>
+          <w:p>
+            <w:pPr>
+              <w:spacing w:after="0" w:before="0" w:line="260"/>
+            </w:pPr>
+            <w:r>
+              <w:rPr>
+                <w:rFonts w:ascii="Courier New" w:cs="Courier New" w:eastAsia="Courier New" w:hAnsi="Courier New"/>
+                <w:color w:val="1E293B"/>
+                <w:sz w:val="15"/>
+                <w:szCs w:val="15"/>
+              </w:rPr>
+              <w:t xml:space="preserve">end module machine_config</w:t>
+            </w:r>
+          </w:p>
+          <w:p>
+            <w:pPr>
+              <w:spacing w:after="0" w:before="0" w:line="260"/>
+            </w:pPr>
+            <w:r>
+              <w:rPr>
+                <w:rFonts w:ascii="Courier New" w:cs="Courier New" w:eastAsia="Courier New" w:hAnsi="Courier New"/>
+                <w:color w:val="1E293B"/>
+                <w:sz w:val="15"/>
+                <w:szCs w:val="15"/>
+              </w:rPr>
+              <w:t xml:space="preserve"> </w:t>
+            </w:r>
+          </w:p>
+          <w:p>
+            <w:pPr>
+              <w:spacing w:after="0" w:before="0" w:line="260"/>
+            </w:pPr>
+            <w:r>
+              <w:rPr>
+                <w:rFonts w:ascii="Courier New" w:cs="Courier New" w:eastAsia="Courier New" w:hAnsi="Courier New"/>
+                <w:color w:val="1E293B"/>
+                <w:sz w:val="15"/>
+                <w:szCs w:val="15"/>
+              </w:rPr>
+              <w:t xml:space="preserve">module system_io</w:t>
+            </w:r>
+          </w:p>
+          <w:p>
+            <w:pPr>
+              <w:spacing w:after="0" w:before="0" w:line="260"/>
+            </w:pPr>
+            <w:r>
+              <w:rPr>
+                <w:rFonts w:ascii="Courier New" w:cs="Courier New" w:eastAsia="Courier New" w:hAnsi="Courier New"/>
+                <w:color w:val="1E293B"/>
+                <w:sz w:val="15"/>
+                <w:szCs w:val="15"/>
+              </w:rPr>
+              <w:t xml:space="preserve">  implicit none</w:t>
+            </w:r>
+          </w:p>
+          <w:p>
+            <w:pPr>
+              <w:spacing w:after="0" w:before="0" w:line="260"/>
+            </w:pPr>
+            <w:r>
+              <w:rPr>
+                <w:rFonts w:ascii="Courier New" w:cs="Courier New" w:eastAsia="Courier New" w:hAnsi="Courier New"/>
+                <w:color w:val="1E293B"/>
+                <w:sz w:val="15"/>
+                <w:szCs w:val="15"/>
+              </w:rPr>
+              <w:t xml:space="preserve">  private</w:t>
+            </w:r>
+          </w:p>
+          <w:p>
+            <w:pPr>
+              <w:spacing w:after="0" w:before="0" w:line="260"/>
+            </w:pPr>
+            <w:r>
+              <w:rPr>
+                <w:rFonts w:ascii="Courier New" w:cs="Courier New" w:eastAsia="Courier New" w:hAnsi="Courier New"/>
+                <w:color w:val="1E293B"/>
+                <w:sz w:val="15"/>
+                <w:szCs w:val="15"/>
+              </w:rPr>
+              <w:t xml:space="preserve">  integer, public :: ibuf = 0, nout = 6, nogo = 0</w:t>
+            </w:r>
+          </w:p>
+          <w:p>
+            <w:pPr>
+              <w:spacing w:after="0" w:before="0" w:line="260"/>
+            </w:pPr>
+            <w:r>
+              <w:rPr>
+                <w:rFonts w:ascii="Courier New" w:cs="Courier New" w:eastAsia="Courier New" w:hAnsi="Courier New"/>
+                <w:color w:val="1E293B"/>
+                <w:sz w:val="15"/>
+                <w:szCs w:val="15"/>
+              </w:rPr>
+              <w:t xml:space="preserve">  public :: xread</w:t>
+            </w:r>
+          </w:p>
+          <w:p>
+            <w:pPr>
+              <w:spacing w:after="0" w:before="0" w:line="260"/>
+            </w:pPr>
+            <w:r>
+              <w:rPr>
+                <w:rFonts w:ascii="Courier New" w:cs="Courier New" w:eastAsia="Courier New" w:hAnsi="Courier New"/>
+                <w:color w:val="1E293B"/>
+                <w:sz w:val="15"/>
+                <w:szCs w:val="15"/>
+              </w:rPr>
+              <w:t xml:space="preserve">contains</w:t>
+            </w:r>
+          </w:p>
+          <w:p>
+            <w:pPr>
+              <w:spacing w:after="0" w:before="0" w:line="260"/>
+            </w:pPr>
+            <w:r>
+              <w:rPr>
+                <w:rFonts w:ascii="Courier New" w:cs="Courier New" w:eastAsia="Courier New" w:hAnsi="Courier New"/>
+                <w:color w:val="1E293B"/>
+                <w:sz w:val="15"/>
+                <w:szCs w:val="15"/>
+              </w:rPr>
+              <w:t xml:space="preserve">  subroutine xread(buf, nwords, status)</w:t>
+            </w:r>
+          </w:p>
+          <w:p>
+            <w:pPr>
+              <w:spacing w:after="0" w:before="0" w:line="260"/>
+            </w:pPr>
+            <w:r>
+              <w:rPr>
+                <w:rFonts w:ascii="Courier New" w:cs="Courier New" w:eastAsia="Courier New" w:hAnsi="Courier New"/>
+                <w:color w:val="1E293B"/>
+                <w:sz w:val="15"/>
+                <w:szCs w:val="15"/>
+              </w:rPr>
+              <w:t xml:space="preserve">    real,    intent(out) :: buf(:)</w:t>
+            </w:r>
+          </w:p>
+          <w:p>
+            <w:pPr>
+              <w:spacing w:after="0" w:before="0" w:line="260"/>
+            </w:pPr>
+            <w:r>
+              <w:rPr>
+                <w:rFonts w:ascii="Courier New" w:cs="Courier New" w:eastAsia="Courier New" w:hAnsi="Courier New"/>
+                <w:color w:val="1E293B"/>
+                <w:sz w:val="15"/>
+                <w:szCs w:val="15"/>
+              </w:rPr>
+              <w:t xml:space="preserve">    integer, intent(in)  :: nwords</w:t>
+            </w:r>
+          </w:p>
+          <w:p>
+            <w:pPr>
+              <w:spacing w:after="0" w:before="0" w:line="260"/>
+            </w:pPr>
+            <w:r>
+              <w:rPr>
+                <w:rFonts w:ascii="Courier New" w:cs="Courier New" w:eastAsia="Courier New" w:hAnsi="Courier New"/>
+                <w:color w:val="1E293B"/>
+                <w:sz w:val="15"/>
+                <w:szCs w:val="15"/>
+              </w:rPr>
+              <w:t xml:space="preserve">    integer, intent(out) :: status</w:t>
+            </w:r>
+          </w:p>
+          <w:p>
+            <w:pPr>
+              <w:spacing w:after="0" w:before="0" w:line="260"/>
+            </w:pPr>
+            <w:r>
+              <w:rPr>
+                <w:rFonts w:ascii="Courier New" w:cs="Courier New" w:eastAsia="Courier New" w:hAnsi="Courier New"/>
+                <w:color w:val="1E293B"/>
+                <w:sz w:val="15"/>
+                <w:szCs w:val="15"/>
+              </w:rPr>
+              <w:t xml:space="preserve">    status = 0</w:t>
+            </w:r>
+          </w:p>
+          <w:p>
+            <w:pPr>
+              <w:spacing w:after="0" w:before="0" w:line="260"/>
+            </w:pPr>
+            <w:r>
+              <w:rPr>
+                <w:rFonts w:ascii="Courier New" w:cs="Courier New" w:eastAsia="Courier New" w:hAnsi="Courier New"/>
+                <w:color w:val="1E293B"/>
+                <w:sz w:val="15"/>
+                <w:szCs w:val="15"/>
+              </w:rPr>
+              <w:t xml:space="preserve">    if (ibuf &lt;= 0) status = -1</w:t>
+            </w:r>
+          </w:p>
+          <w:p>
+            <w:pPr>
+              <w:spacing w:after="0" w:before="0" w:line="260"/>
+            </w:pPr>
+            <w:r>
+              <w:rPr>
+                <w:rFonts w:ascii="Courier New" w:cs="Courier New" w:eastAsia="Courier New" w:hAnsi="Courier New"/>
+                <w:color w:val="1E293B"/>
+                <w:sz w:val="15"/>
+                <w:szCs w:val="15"/>
+              </w:rPr>
+              <w:t xml:space="preserve">  end subroutine xread</w:t>
+            </w:r>
+          </w:p>
+          <w:p>
+            <w:pPr>
+              <w:spacing w:after="0" w:before="0" w:line="260"/>
+            </w:pPr>
+            <w:r>
+              <w:rPr>
+                <w:rFonts w:ascii="Courier New" w:cs="Courier New" w:eastAsia="Courier New" w:hAnsi="Courier New"/>
+                <w:color w:val="1E293B"/>
+                <w:sz w:val="15"/>
+                <w:szCs w:val="15"/>
+              </w:rPr>
+              <w:t xml:space="preserve">end module system_io</w:t>
+            </w:r>
+          </w:p>
+        </w:tc>
+      </w:tr>
+    </w:tbl>
+    <w:p>
+      <w:pPr>
+        <w:spacing w:before="240"/>
+      </w:pPr>
+    </w:p>
+    <w:p>
+      <w:pPr>
+        <w:pStyle w:val="Heading2"/>
+      </w:pPr>
+      <w:r>
+        <w:t xml:space="preserve">Example 3: EQUIVALENCE Memory Aliasing → Proper Typed Variables</w:t>
+      </w:r>
+    </w:p>
+    <w:p>
+      <w:pPr>
+        <w:spacing w:after="160"/>
+      </w:pPr>
+      <w:r>
+        <w:rPr>
+          <w:rFonts w:ascii="Calibri" w:cs="Calibri" w:eastAsia="Calibri" w:hAnsi="Calibri"/>
+          <w:i/>
+          <w:iCs/>
+          <w:color w:val="1E293B"/>
+          <w:sz w:val="20"/>
+          <w:szCs w:val="20"/>
+        </w:rPr>
+        <w:t xml:space="preserve">Removes dangerous type-punning where INTEGER and REAL share the same memory address. Prevents subtle numerical bugs in production.</w:t>
+      </w:r>
+    </w:p>
+    <w:tbl>
+      <w:tblPr>
+        <w:tblW w:type="dxa" w:w="9360"/>
+        <w:tblBorders>
+          <w:top w:val="single" w:color="auto" w:sz="4"/>
+          <w:left w:val="single" w:color="auto" w:sz="4"/>
+          <w:bottom w:val="single" w:color="auto" w:sz="4"/>
+          <w:right w:val="single" w:color="auto" w:sz="4"/>
+          <w:insideH w:val="single" w:color="auto" w:sz="4"/>
+          <w:insideV w:val="single" w:color="auto" w:sz="4"/>
+        </w:tblBorders>
+      </w:tblPr>
+      <w:tblGrid>
+        <w:gridCol w:w="9360"/>
+      </w:tblGrid>
+      <w:tr>
+        <w:tc>
+          <w:tcPr>
+            <w:tcW w:type="dxa" w:w="9360"/>
+            <w:tcBorders>
+              <w:top w:val="single" w:color="E2E8F0" w:sz="1"/>
+              <w:left w:val="single" w:color="E2E8F0" w:sz="1"/>
+              <w:bottom w:val="none" w:color="FFFFFF" w:sz="0"/>
+              <w:right w:val="single" w:color="E2E8F0" w:sz="1"/>
+            </w:tcBorders>
+            <w:shd w:fill="DC2626" w:val="clear"/>
+            <w:tcMar>
+              <w:top w:type="dxa" w:w="40"/>
+              <w:left w:type="dxa" w:w="120"/>
+              <w:bottom w:type="dxa" w:w="40"/>
+              <w:right w:type="dxa" w:w="120"/>
+            </w:tcMar>
+          </w:tcPr>
+          <w:p>
+            <w:r>
+              <w:rPr>
+                <w:rFonts w:ascii="Calibri" w:cs="Calibri" w:eastAsia="Calibri" w:hAnsi="Calibri"/>
+                <w:b/>
+                <w:bCs/>
+                <w:color w:val="FFFFFF"/>
+                <w:sz w:val="16"/>
+                <w:szCs w:val="16"/>
+              </w:rPr>
+              <w:t xml:space="preserve">✖  BEFORE — Legacy FORTRAN</w:t>
+            </w:r>
+          </w:p>
+        </w:tc>
+      </w:tr>
+    </w:tbl>
+    <w:tbl>
+      <w:tblPr>
+        <w:tblW w:type="dxa" w:w="9360"/>
+        <w:tblBorders>
+          <w:top w:val="single" w:color="auto" w:sz="4"/>
+          <w:left w:val="single" w:color="auto" w:sz="4"/>
+          <w:bottom w:val="single" w:color="auto" w:sz="4"/>
+          <w:right w:val="single" w:color="auto" w:sz="4"/>
+          <w:insideH w:val="single" w:color="auto" w:sz="4"/>
+          <w:insideV w:val="single" w:color="auto" w:sz="4"/>
+        </w:tblBorders>
+      </w:tblPr>
+      <w:tblGrid>
+        <w:gridCol w:w="9360"/>
+      </w:tblGrid>
+      <w:tr>
+        <w:tc>
+          <w:tcPr>
+            <w:tcW w:type="dxa" w:w="9360"/>
+            <w:tcBorders>
+              <w:top w:val="none" w:color="FFFFFF" w:sz="0"/>
+              <w:left w:val="single" w:color="E2E8F0" w:sz="1"/>
+              <w:bottom w:val="single" w:color="E2E8F0" w:sz="1"/>
+              <w:right w:val="single" w:color="E2E8F0" w:sz="1"/>
+            </w:tcBorders>
+            <w:shd w:fill="FFF5F5" w:val="clear"/>
+            <w:tcMar>
+              <w:top w:type="dxa" w:w="80"/>
+              <w:left w:type="dxa" w:w="160"/>
+              <w:bottom w:type="dxa" w:w="80"/>
+              <w:right w:type="dxa" w:w="160"/>
+            </w:tcMar>
+          </w:tcPr>
+          <w:p>
+            <w:pPr>
+              <w:spacing w:after="0" w:before="0" w:line="260"/>
+            </w:pPr>
+            <w:r>
+              <w:rPr>
+                <w:rFonts w:ascii="Courier New" w:cs="Courier New" w:eastAsia="Courier New" w:hAnsi="Courier New"/>
+                <w:color w:val="1E293B"/>
+                <w:sz w:val="15"/>
+                <w:szCs w:val="15"/>
+              </w:rPr>
+              <w:t xml:space="preserve">      SUBROUTINE PACK(DATA, IDATA, N)</w:t>
+            </w:r>
+          </w:p>
+          <w:p>
+            <w:pPr>
+              <w:spacing w:after="0" w:before="0" w:line="260"/>
+            </w:pPr>
+            <w:r>
+              <w:rPr>
+                <w:rFonts w:ascii="Courier New" w:cs="Courier New" w:eastAsia="Courier New" w:hAnsi="Courier New"/>
+                <w:color w:val="1E293B"/>
+                <w:sz w:val="15"/>
+                <w:szCs w:val="15"/>
+              </w:rPr>
+              <w:t xml:space="preserve">C     USE EQUIVALENCE TO TREAT SAME MEMORY AS</w:t>
+            </w:r>
+          </w:p>
+          <w:p>
+            <w:pPr>
+              <w:spacing w:after="0" w:before="0" w:line="260"/>
+            </w:pPr>
+            <w:r>
+              <w:rPr>
+                <w:rFonts w:ascii="Courier New" w:cs="Courier New" w:eastAsia="Courier New" w:hAnsi="Courier New"/>
+                <w:color w:val="1E293B"/>
+                <w:sz w:val="15"/>
+                <w:szCs w:val="15"/>
+              </w:rPr>
+              <w:t xml:space="preserve">C     BOTH REAL AND INTEGER</w:t>
+            </w:r>
+          </w:p>
+          <w:p>
+            <w:pPr>
+              <w:spacing w:after="0" w:before="0" w:line="260"/>
+            </w:pPr>
+            <w:r>
+              <w:rPr>
+                <w:rFonts w:ascii="Courier New" w:cs="Courier New" w:eastAsia="Courier New" w:hAnsi="Courier New"/>
+                <w:color w:val="1E293B"/>
+                <w:sz w:val="15"/>
+                <w:szCs w:val="15"/>
+              </w:rPr>
+              <w:t xml:space="preserve">      REAL DATA(N)</w:t>
+            </w:r>
+          </w:p>
+          <w:p>
+            <w:pPr>
+              <w:spacing w:after="0" w:before="0" w:line="260"/>
+            </w:pPr>
+            <w:r>
+              <w:rPr>
+                <w:rFonts w:ascii="Courier New" w:cs="Courier New" w:eastAsia="Courier New" w:hAnsi="Courier New"/>
+                <w:color w:val="1E293B"/>
+                <w:sz w:val="15"/>
+                <w:szCs w:val="15"/>
+              </w:rPr>
+              <w:t xml:space="preserve">      INTEGER IDATA(N)</w:t>
+            </w:r>
+          </w:p>
+          <w:p>
+            <w:pPr>
+              <w:spacing w:after="0" w:before="0" w:line="260"/>
+            </w:pPr>
+            <w:r>
+              <w:rPr>
+                <w:rFonts w:ascii="Courier New" w:cs="Courier New" w:eastAsia="Courier New" w:hAnsi="Courier New"/>
+                <w:color w:val="1E293B"/>
+                <w:sz w:val="15"/>
+                <w:szCs w:val="15"/>
+              </w:rPr>
+              <w:t xml:space="preserve">      EQUIVALENCE (DATA(1), IDATA(1))</w:t>
+            </w:r>
+          </w:p>
+          <w:p>
+            <w:pPr>
+              <w:spacing w:after="0" w:before="0" w:line="260"/>
+            </w:pPr>
+            <w:r>
+              <w:rPr>
+                <w:rFonts w:ascii="Courier New" w:cs="Courier New" w:eastAsia="Courier New" w:hAnsi="Courier New"/>
+                <w:color w:val="1E293B"/>
+                <w:sz w:val="15"/>
+                <w:szCs w:val="15"/>
+              </w:rPr>
+              <w:t xml:space="preserve">C</w:t>
+            </w:r>
+          </w:p>
+          <w:p>
+            <w:pPr>
+              <w:spacing w:after="0" w:before="0" w:line="260"/>
+            </w:pPr>
+            <w:r>
+              <w:rPr>
+                <w:rFonts w:ascii="Courier New" w:cs="Courier New" w:eastAsia="Courier New" w:hAnsi="Courier New"/>
+                <w:color w:val="1E293B"/>
+                <w:sz w:val="15"/>
+                <w:szCs w:val="15"/>
+              </w:rPr>
+              <w:t xml:space="preserve">C     STORE INTEGER FLAGS IN REAL ARRAY</w:t>
+            </w:r>
+          </w:p>
+          <w:p>
+            <w:pPr>
+              <w:spacing w:after="0" w:before="0" w:line="260"/>
+            </w:pPr>
+            <w:r>
+              <w:rPr>
+                <w:rFonts w:ascii="Courier New" w:cs="Courier New" w:eastAsia="Courier New" w:hAnsi="Courier New"/>
+                <w:color w:val="1E293B"/>
+                <w:sz w:val="15"/>
+                <w:szCs w:val="15"/>
+              </w:rPr>
+              <w:t xml:space="preserve">      IDATA(1) = 1</w:t>
+            </w:r>
+          </w:p>
+          <w:p>
+            <w:pPr>
+              <w:spacing w:after="0" w:before="0" w:line="260"/>
+            </w:pPr>
+            <w:r>
+              <w:rPr>
+                <w:rFonts w:ascii="Courier New" w:cs="Courier New" w:eastAsia="Courier New" w:hAnsi="Courier New"/>
+                <w:color w:val="1E293B"/>
+                <w:sz w:val="15"/>
+                <w:szCs w:val="15"/>
+              </w:rPr>
+              <w:t xml:space="preserve">      IDATA(2) = N</w:t>
+            </w:r>
+          </w:p>
+          <w:p>
+            <w:pPr>
+              <w:spacing w:after="0" w:before="0" w:line="260"/>
+            </w:pPr>
+            <w:r>
+              <w:rPr>
+                <w:rFonts w:ascii="Courier New" w:cs="Courier New" w:eastAsia="Courier New" w:hAnsi="Courier New"/>
+                <w:color w:val="1E293B"/>
+                <w:sz w:val="15"/>
+                <w:szCs w:val="15"/>
+              </w:rPr>
+              <w:t xml:space="preserve">C     NOW DATA(1) CONTAINS GARBAGE FLOAT VALUE</w:t>
+            </w:r>
+          </w:p>
+          <w:p>
+            <w:pPr>
+              <w:spacing w:after="0" w:before="0" w:line="260"/>
+            </w:pPr>
+            <w:r>
+              <w:rPr>
+                <w:rFonts w:ascii="Courier New" w:cs="Courier New" w:eastAsia="Courier New" w:hAnsi="Courier New"/>
+                <w:color w:val="1E293B"/>
+                <w:sz w:val="15"/>
+                <w:szCs w:val="15"/>
+              </w:rPr>
+              <w:t xml:space="preserve">      DATA(3) = 3.14159</w:t>
+            </w:r>
+          </w:p>
+          <w:p>
+            <w:pPr>
+              <w:spacing w:after="0" w:before="0" w:line="260"/>
+            </w:pPr>
+            <w:r>
+              <w:rPr>
+                <w:rFonts w:ascii="Courier New" w:cs="Courier New" w:eastAsia="Courier New" w:hAnsi="Courier New"/>
+                <w:color w:val="1E293B"/>
+                <w:sz w:val="15"/>
+                <w:szCs w:val="15"/>
+              </w:rPr>
+              <w:t xml:space="preserve">C     NOW IDATA(3) CONTAINS GARBAGE INT VALUE</w:t>
+            </w:r>
+          </w:p>
+          <w:p>
+            <w:pPr>
+              <w:spacing w:after="0" w:before="0" w:line="260"/>
+            </w:pPr>
+            <w:r>
+              <w:rPr>
+                <w:rFonts w:ascii="Courier New" w:cs="Courier New" w:eastAsia="Courier New" w:hAnsi="Courier New"/>
+                <w:color w:val="1E293B"/>
+                <w:sz w:val="15"/>
+                <w:szCs w:val="15"/>
+              </w:rPr>
+              <w:t xml:space="preserve">      RETURN</w:t>
+            </w:r>
+          </w:p>
+          <w:p>
+            <w:pPr>
+              <w:spacing w:after="0" w:before="0" w:line="260"/>
+            </w:pPr>
+            <w:r>
+              <w:rPr>
+                <w:rFonts w:ascii="Courier New" w:cs="Courier New" w:eastAsia="Courier New" w:hAnsi="Courier New"/>
+                <w:color w:val="1E293B"/>
+                <w:sz w:val="15"/>
+                <w:szCs w:val="15"/>
+              </w:rPr>
+              <w:t xml:space="preserve">      END</w:t>
+            </w:r>
+          </w:p>
+        </w:tc>
+      </w:tr>
+    </w:tbl>
+    <w:p>
+      <w:pPr>
+        <w:spacing w:before="120"/>
+      </w:pPr>
+    </w:p>
+    <w:tbl>
+      <w:tblPr>
+        <w:tblW w:type="dxa" w:w="9360"/>
+        <w:tblBorders>
+          <w:top w:val="single" w:color="auto" w:sz="4"/>
+          <w:left w:val="single" w:color="auto" w:sz="4"/>
+          <w:bottom w:val="single" w:color="auto" w:sz="4"/>
+          <w:right w:val="single" w:color="auto" w:sz="4"/>
+          <w:insideH w:val="single" w:color="auto" w:sz="4"/>
+          <w:insideV w:val="single" w:color="auto" w:sz="4"/>
+        </w:tblBorders>
+      </w:tblPr>
+      <w:tblGrid>
+        <w:gridCol w:w="9360"/>
+      </w:tblGrid>
+      <w:tr>
+        <w:tc>
+          <w:tcPr>
+            <w:tcW w:type="dxa" w:w="9360"/>
+            <w:tcBorders>
+              <w:top w:val="single" w:color="E2E8F0" w:sz="1"/>
+              <w:left w:val="single" w:color="E2E8F0" w:sz="1"/>
+              <w:bottom w:val="none" w:color="FFFFFF" w:sz="0"/>
+              <w:right w:val="single" w:color="E2E8F0" w:sz="1"/>
+            </w:tcBorders>
+            <w:shd w:fill="00A651" w:val="clear"/>
+            <w:tcMar>
+              <w:top w:type="dxa" w:w="40"/>
+              <w:left w:type="dxa" w:w="120"/>
+              <w:bottom w:type="dxa" w:w="40"/>
+              <w:right w:type="dxa" w:w="120"/>
+            </w:tcMar>
+          </w:tcPr>
+          <w:p>
+            <w:r>
+              <w:rPr>
+                <w:rFonts w:ascii="Calibri" w:cs="Calibri" w:eastAsia="Calibri" w:hAnsi="Calibri"/>
+                <w:b/>
+                <w:bCs/>
+                <w:color w:val="FFFFFF"/>
+                <w:sz w:val="16"/>
+                <w:szCs w:val="16"/>
+              </w:rPr>
+              <w:t xml:space="preserve">✔  AFTER — Modern Fortran 2018</w:t>
+            </w:r>
+          </w:p>
+        </w:tc>
+      </w:tr>
+    </w:tbl>
+    <w:tbl>
+      <w:tblPr>
+        <w:tblW w:type="dxa" w:w="9360"/>
+        <w:tblBorders>
+          <w:top w:val="single" w:color="auto" w:sz="4"/>
+          <w:left w:val="single" w:color="auto" w:sz="4"/>
+          <w:bottom w:val="single" w:color="auto" w:sz="4"/>
+          <w:right w:val="single" w:color="auto" w:sz="4"/>
+          <w:insideH w:val="single" w:color="auto" w:sz="4"/>
+          <w:insideV w:val="single" w:color="auto" w:sz="4"/>
+        </w:tblBorders>
+      </w:tblPr>
+      <w:tblGrid>
+        <w:gridCol w:w="9360"/>
+      </w:tblGrid>
+      <w:tr>
+        <w:tc>
+          <w:tcPr>
+            <w:tcW w:type="dxa" w:w="9360"/>
+            <w:tcBorders>
+              <w:top w:val="none" w:color="FFFFFF" w:sz="0"/>
+              <w:left w:val="single" w:color="E2E8F0" w:sz="1"/>
+              <w:bottom w:val="single" w:color="E2E8F0" w:sz="1"/>
+              <w:right w:val="single" w:color="E2E8F0" w:sz="1"/>
+            </w:tcBorders>
+            <w:shd w:fill="F0FFF4" w:val="clear"/>
+            <w:tcMar>
+              <w:top w:type="dxa" w:w="80"/>
+              <w:left w:type="dxa" w:w="160"/>
+              <w:bottom w:type="dxa" w:w="80"/>
+              <w:right w:type="dxa" w:w="160"/>
+            </w:tcMar>
+          </w:tcPr>
+          <w:p>
+            <w:pPr>
+              <w:spacing w:after="0" w:before="0" w:line="260"/>
+            </w:pPr>
+            <w:r>
+              <w:rPr>
+                <w:rFonts w:ascii="Courier New" w:cs="Courier New" w:eastAsia="Courier New" w:hAnsi="Courier New"/>
+                <w:color w:val="1E293B"/>
+                <w:sz w:val="15"/>
+                <w:szCs w:val="15"/>
+              </w:rPr>
+              <w:t xml:space="preserve">module data_packer</w:t>
+            </w:r>
+          </w:p>
+          <w:p>
+            <w:pPr>
+              <w:spacing w:after="0" w:before="0" w:line="260"/>
+            </w:pPr>
+            <w:r>
+              <w:rPr>
+                <w:rFonts w:ascii="Courier New" w:cs="Courier New" w:eastAsia="Courier New" w:hAnsi="Courier New"/>
+                <w:color w:val="1E293B"/>
+                <w:sz w:val="15"/>
+                <w:szCs w:val="15"/>
+              </w:rPr>
+              <w:t xml:space="preserve">  implicit none</w:t>
+            </w:r>
+          </w:p>
+          <w:p>
+            <w:pPr>
+              <w:spacing w:after="0" w:before="0" w:line="260"/>
+            </w:pPr>
+            <w:r>
+              <w:rPr>
+                <w:rFonts w:ascii="Courier New" w:cs="Courier New" w:eastAsia="Courier New" w:hAnsi="Courier New"/>
+                <w:color w:val="1E293B"/>
+                <w:sz w:val="15"/>
+                <w:szCs w:val="15"/>
+              </w:rPr>
+              <w:t xml:space="preserve"> </w:t>
+            </w:r>
+          </w:p>
+          <w:p>
+            <w:pPr>
+              <w:spacing w:after="0" w:before="0" w:line="260"/>
+            </w:pPr>
+            <w:r>
+              <w:rPr>
+                <w:rFonts w:ascii="Courier New" w:cs="Courier New" w:eastAsia="Courier New" w:hAnsi="Courier New"/>
+                <w:color w:val="1E293B"/>
+                <w:sz w:val="15"/>
+                <w:szCs w:val="15"/>
+              </w:rPr>
+              <w:t xml:space="preserve">  type :: packed_record</w:t>
+            </w:r>
+          </w:p>
+          <w:p>
+            <w:pPr>
+              <w:spacing w:after="0" w:before="0" w:line="260"/>
+            </w:pPr>
+            <w:r>
+              <w:rPr>
+                <w:rFonts w:ascii="Courier New" w:cs="Courier New" w:eastAsia="Courier New" w:hAnsi="Courier New"/>
+                <w:color w:val="1E293B"/>
+                <w:sz w:val="15"/>
+                <w:szCs w:val="15"/>
+              </w:rPr>
+              <w:t xml:space="preserve">    integer :: flag     = 0</w:t>
+            </w:r>
+          </w:p>
+          <w:p>
+            <w:pPr>
+              <w:spacing w:after="0" w:before="0" w:line="260"/>
+            </w:pPr>
+            <w:r>
+              <w:rPr>
+                <w:rFonts w:ascii="Courier New" w:cs="Courier New" w:eastAsia="Courier New" w:hAnsi="Courier New"/>
+                <w:color w:val="1E293B"/>
+                <w:sz w:val="15"/>
+                <w:szCs w:val="15"/>
+              </w:rPr>
+              <w:t xml:space="preserve">    integer :: count    = 0</w:t>
+            </w:r>
+          </w:p>
+          <w:p>
+            <w:pPr>
+              <w:spacing w:after="0" w:before="0" w:line="260"/>
+            </w:pPr>
+            <w:r>
+              <w:rPr>
+                <w:rFonts w:ascii="Courier New" w:cs="Courier New" w:eastAsia="Courier New" w:hAnsi="Courier New"/>
+                <w:color w:val="1E293B"/>
+                <w:sz w:val="15"/>
+                <w:szCs w:val="15"/>
+              </w:rPr>
+              <w:t xml:space="preserve">    real    :: value    = 0.0</w:t>
+            </w:r>
+          </w:p>
+          <w:p>
+            <w:pPr>
+              <w:spacing w:after="0" w:before="0" w:line="260"/>
+            </w:pPr>
+            <w:r>
+              <w:rPr>
+                <w:rFonts w:ascii="Courier New" w:cs="Courier New" w:eastAsia="Courier New" w:hAnsi="Courier New"/>
+                <w:color w:val="1E293B"/>
+                <w:sz w:val="15"/>
+                <w:szCs w:val="15"/>
+              </w:rPr>
+              <w:t xml:space="preserve">  end type packed_record</w:t>
+            </w:r>
+          </w:p>
+          <w:p>
+            <w:pPr>
+              <w:spacing w:after="0" w:before="0" w:line="260"/>
+            </w:pPr>
+            <w:r>
+              <w:rPr>
+                <w:rFonts w:ascii="Courier New" w:cs="Courier New" w:eastAsia="Courier New" w:hAnsi="Courier New"/>
+                <w:color w:val="1E293B"/>
+                <w:sz w:val="15"/>
+                <w:szCs w:val="15"/>
+              </w:rPr>
+              <w:t xml:space="preserve"> </w:t>
+            </w:r>
+          </w:p>
+          <w:p>
+            <w:pPr>
+              <w:spacing w:after="0" w:before="0" w:line="260"/>
+            </w:pPr>
+            <w:r>
+              <w:rPr>
+                <w:rFonts w:ascii="Courier New" w:cs="Courier New" w:eastAsia="Courier New" w:hAnsi="Courier New"/>
+                <w:color w:val="1E293B"/>
+                <w:sz w:val="15"/>
+                <w:szCs w:val="15"/>
+              </w:rPr>
+              <w:t xml:space="preserve">contains</w:t>
+            </w:r>
+          </w:p>
+          <w:p>
+            <w:pPr>
+              <w:spacing w:after="0" w:before="0" w:line="260"/>
+            </w:pPr>
+            <w:r>
+              <w:rPr>
+                <w:rFonts w:ascii="Courier New" w:cs="Courier New" w:eastAsia="Courier New" w:hAnsi="Courier New"/>
+                <w:color w:val="1E293B"/>
+                <w:sz w:val="15"/>
+                <w:szCs w:val="15"/>
+              </w:rPr>
+              <w:t xml:space="preserve">  subroutine pack(record, n)</w:t>
+            </w:r>
+          </w:p>
+          <w:p>
+            <w:pPr>
+              <w:spacing w:after="0" w:before="0" w:line="260"/>
+            </w:pPr>
+            <w:r>
+              <w:rPr>
+                <w:rFonts w:ascii="Courier New" w:cs="Courier New" w:eastAsia="Courier New" w:hAnsi="Courier New"/>
+                <w:color w:val="1E293B"/>
+                <w:sz w:val="15"/>
+                <w:szCs w:val="15"/>
+              </w:rPr>
+              <w:t xml:space="preserve">    type(packed_record), intent(out) :: record</w:t>
+            </w:r>
+          </w:p>
+          <w:p>
+            <w:pPr>
+              <w:spacing w:after="0" w:before="0" w:line="260"/>
+            </w:pPr>
+            <w:r>
+              <w:rPr>
+                <w:rFonts w:ascii="Courier New" w:cs="Courier New" w:eastAsia="Courier New" w:hAnsi="Courier New"/>
+                <w:color w:val="1E293B"/>
+                <w:sz w:val="15"/>
+                <w:szCs w:val="15"/>
+              </w:rPr>
+              <w:t xml:space="preserve">    integer,             intent(in)  :: n</w:t>
+            </w:r>
+          </w:p>
+          <w:p>
+            <w:pPr>
+              <w:spacing w:after="0" w:before="0" w:line="260"/>
+            </w:pPr>
+            <w:r>
+              <w:rPr>
+                <w:rFonts w:ascii="Courier New" w:cs="Courier New" w:eastAsia="Courier New" w:hAnsi="Courier New"/>
+                <w:color w:val="1E293B"/>
+                <w:sz w:val="15"/>
+                <w:szCs w:val="15"/>
+              </w:rPr>
+              <w:t xml:space="preserve"> </w:t>
+            </w:r>
+          </w:p>
+          <w:p>
+            <w:pPr>
+              <w:spacing w:after="0" w:before="0" w:line="260"/>
+            </w:pPr>
+            <w:r>
+              <w:rPr>
+                <w:rFonts w:ascii="Courier New" w:cs="Courier New" w:eastAsia="Courier New" w:hAnsi="Courier New"/>
+                <w:color w:val="1E293B"/>
+                <w:sz w:val="15"/>
+                <w:szCs w:val="15"/>
+              </w:rPr>
+              <w:t xml:space="preserve">    record%flag  = 1</w:t>
+            </w:r>
+          </w:p>
+          <w:p>
+            <w:pPr>
+              <w:spacing w:after="0" w:before="0" w:line="260"/>
+            </w:pPr>
+            <w:r>
+              <w:rPr>
+                <w:rFonts w:ascii="Courier New" w:cs="Courier New" w:eastAsia="Courier New" w:hAnsi="Courier New"/>
+                <w:color w:val="1E293B"/>
+                <w:sz w:val="15"/>
+                <w:szCs w:val="15"/>
+              </w:rPr>
+              <w:t xml:space="preserve">    record%count = n</w:t>
+            </w:r>
+          </w:p>
+          <w:p>
+            <w:pPr>
+              <w:spacing w:after="0" w:before="0" w:line="260"/>
+            </w:pPr>
+            <w:r>
+              <w:rPr>
+                <w:rFonts w:ascii="Courier New" w:cs="Courier New" w:eastAsia="Courier New" w:hAnsi="Courier New"/>
+                <w:color w:val="1E293B"/>
+                <w:sz w:val="15"/>
+                <w:szCs w:val="15"/>
+              </w:rPr>
+              <w:t xml:space="preserve">    record%value = 3.14159</w:t>
+            </w:r>
+          </w:p>
+          <w:p>
+            <w:pPr>
+              <w:spacing w:after="0" w:before="0" w:line="260"/>
+            </w:pPr>
+            <w:r>
+              <w:rPr>
+                <w:rFonts w:ascii="Courier New" w:cs="Courier New" w:eastAsia="Courier New" w:hAnsi="Courier New"/>
+                <w:color w:val="1E293B"/>
+                <w:sz w:val="15"/>
+                <w:szCs w:val="15"/>
+              </w:rPr>
+              <w:t xml:space="preserve">    ! Each field has its own memory — no aliasing</w:t>
+            </w:r>
+          </w:p>
+          <w:p>
+            <w:pPr>
+              <w:spacing w:after="0" w:before="0" w:line="260"/>
+            </w:pPr>
+            <w:r>
+              <w:rPr>
+                <w:rFonts w:ascii="Courier New" w:cs="Courier New" w:eastAsia="Courier New" w:hAnsi="Courier New"/>
+                <w:color w:val="1E293B"/>
+                <w:sz w:val="15"/>
+                <w:szCs w:val="15"/>
+              </w:rPr>
+              <w:t xml:space="preserve">  end subroutine pack</w:t>
+            </w:r>
+          </w:p>
+          <w:p>
+            <w:pPr>
+              <w:spacing w:after="0" w:before="0" w:line="260"/>
+            </w:pPr>
+            <w:r>
+              <w:rPr>
+                <w:rFonts w:ascii="Courier New" w:cs="Courier New" w:eastAsia="Courier New" w:hAnsi="Courier New"/>
+                <w:color w:val="1E293B"/>
+                <w:sz w:val="15"/>
+                <w:szCs w:val="15"/>
+              </w:rPr>
+              <w:t xml:space="preserve">end module data_packer</w:t>
+            </w:r>
+          </w:p>
+        </w:tc>
+      </w:tr>
+    </w:tbl>
+    <w:p>
+      <w:pPr>
+        <w:spacing w:before="240"/>
+      </w:pPr>
+    </w:p>
+    <w:p>
+      <w:pPr>
+        <w:pStyle w:val="Heading2"/>
+      </w:pPr>
+      <w:r>
+        <w:t xml:space="preserve">Example 4: Arithmetic IF / Computed GOTO → SELECT CASE</w:t>
+      </w:r>
+    </w:p>
+    <w:p>
+      <w:pPr>
+        <w:spacing w:after="160"/>
+      </w:pPr>
+      <w:r>
+        <w:rPr>
+          <w:rFonts w:ascii="Calibri" w:cs="Calibri" w:eastAsia="Calibri" w:hAnsi="Calibri"/>
+          <w:i/>
+          <w:iCs/>
+          <w:color w:val="1E293B"/>
+          <w:sz w:val="20"/>
+          <w:szCs w:val="20"/>
+        </w:rPr>
+        <w:t xml:space="preserve">Replaces the deprecated three-way arithmetic IF and computed GOTO dispatch with readable SELECT CASE. Critical for maintainability in large codebases.</w:t>
+      </w:r>
+    </w:p>
+    <w:tbl>
+      <w:tblPr>
+        <w:tblW w:type="dxa" w:w="9360"/>
+        <w:tblBorders>
+          <w:top w:val="single" w:color="auto" w:sz="4"/>
+          <w:left w:val="single" w:color="auto" w:sz="4"/>
+          <w:bottom w:val="single" w:color="auto" w:sz="4"/>
+          <w:right w:val="single" w:color="auto" w:sz="4"/>
+          <w:insideH w:val="single" w:color="auto" w:sz="4"/>
+          <w:insideV w:val="single" w:color="auto" w:sz="4"/>
+        </w:tblBorders>
+      </w:tblPr>
+      <w:tblGrid>
+        <w:gridCol w:w="9360"/>
+      </w:tblGrid>
+      <w:tr>
+        <w:tc>
+          <w:tcPr>
+            <w:tcW w:type="dxa" w:w="9360"/>
+            <w:tcBorders>
+              <w:top w:val="single" w:color="E2E8F0" w:sz="1"/>
+              <w:left w:val="single" w:color="E2E8F0" w:sz="1"/>
+              <w:bottom w:val="none" w:color="FFFFFF" w:sz="0"/>
+              <w:right w:val="single" w:color="E2E8F0" w:sz="1"/>
+            </w:tcBorders>
+            <w:shd w:fill="DC2626" w:val="clear"/>
+            <w:tcMar>
+              <w:top w:type="dxa" w:w="40"/>
+              <w:left w:type="dxa" w:w="120"/>
+              <w:bottom w:type="dxa" w:w="40"/>
+              <w:right w:type="dxa" w:w="120"/>
+            </w:tcMar>
+          </w:tcPr>
+          <w:p>
+            <w:r>
+              <w:rPr>
+                <w:rFonts w:ascii="Calibri" w:cs="Calibri" w:eastAsia="Calibri" w:hAnsi="Calibri"/>
+                <w:b/>
+                <w:bCs/>
+                <w:color w:val="FFFFFF"/>
+                <w:sz w:val="16"/>
+                <w:szCs w:val="16"/>
+              </w:rPr>
+              <w:t xml:space="preserve">✖  BEFORE — Legacy FORTRAN</w:t>
+            </w:r>
+          </w:p>
+        </w:tc>
+      </w:tr>
+    </w:tbl>
+    <w:tbl>
+      <w:tblPr>
+        <w:tblW w:type="dxa" w:w="9360"/>
+        <w:tblBorders>
+          <w:top w:val="single" w:color="auto" w:sz="4"/>
+          <w:left w:val="single" w:color="auto" w:sz="4"/>
+          <w:bottom w:val="single" w:color="auto" w:sz="4"/>
+          <w:right w:val="single" w:color="auto" w:sz="4"/>
+          <w:insideH w:val="single" w:color="auto" w:sz="4"/>
+          <w:insideV w:val="single" w:color="auto" w:sz="4"/>
+        </w:tblBorders>
+      </w:tblPr>
+      <w:tblGrid>
+        <w:gridCol w:w="9360"/>
+      </w:tblGrid>
+      <w:tr>
+        <w:tc>
+          <w:tcPr>
+            <w:tcW w:type="dxa" w:w="9360"/>
+            <w:tcBorders>
+              <w:top w:val="none" w:color="FFFFFF" w:sz="0"/>
+              <w:left w:val="single" w:color="E2E8F0" w:sz="1"/>
+              <w:bottom w:val="single" w:color="E2E8F0" w:sz="1"/>
+              <w:right w:val="single" w:color="E2E8F0" w:sz="1"/>
+            </w:tcBorders>
+            <w:shd w:fill="FFF5F5" w:val="clear"/>
+            <w:tcMar>
+              <w:top w:type="dxa" w:w="80"/>
+              <w:left w:type="dxa" w:w="160"/>
+              <w:bottom w:type="dxa" w:w="80"/>
+              <w:right w:type="dxa" w:w="160"/>
+            </w:tcMar>
+          </w:tcPr>
+          <w:p>
+            <w:pPr>
+              <w:spacing w:after="0" w:before="0" w:line="260"/>
+            </w:pPr>
+            <w:r>
+              <w:rPr>
+                <w:rFonts w:ascii="Courier New" w:cs="Courier New" w:eastAsia="Courier New" w:hAnsi="Courier New"/>
+                <w:color w:val="1E293B"/>
+                <w:sz w:val="15"/>
+                <w:szCs w:val="15"/>
+              </w:rPr>
+              <w:t xml:space="preserve">      SUBROUTINE DISPATCH(ITYPE, A, B, RESULT)</w:t>
+            </w:r>
+          </w:p>
+          <w:p>
+            <w:pPr>
+              <w:spacing w:after="0" w:before="0" w:line="260"/>
+            </w:pPr>
+            <w:r>
+              <w:rPr>
+                <w:rFonts w:ascii="Courier New" w:cs="Courier New" w:eastAsia="Courier New" w:hAnsi="Courier New"/>
+                <w:color w:val="1E293B"/>
+                <w:sz w:val="15"/>
+                <w:szCs w:val="15"/>
+              </w:rPr>
+              <w:t xml:space="preserve">      REAL A, B, RESULT</w:t>
+            </w:r>
+          </w:p>
+          <w:p>
+            <w:pPr>
+              <w:spacing w:after="0" w:before="0" w:line="260"/>
+            </w:pPr>
+            <w:r>
+              <w:rPr>
+                <w:rFonts w:ascii="Courier New" w:cs="Courier New" w:eastAsia="Courier New" w:hAnsi="Courier New"/>
+                <w:color w:val="1E293B"/>
+                <w:sz w:val="15"/>
+                <w:szCs w:val="15"/>
+              </w:rPr>
+              <w:t xml:space="preserve">      INTEGER ITYPE</w:t>
+            </w:r>
+          </w:p>
+          <w:p>
+            <w:pPr>
+              <w:spacing w:after="0" w:before="0" w:line="260"/>
+            </w:pPr>
+            <w:r>
+              <w:rPr>
+                <w:rFonts w:ascii="Courier New" w:cs="Courier New" w:eastAsia="Courier New" w:hAnsi="Courier New"/>
+                <w:color w:val="1E293B"/>
+                <w:sz w:val="15"/>
+                <w:szCs w:val="15"/>
+              </w:rPr>
+              <w:t xml:space="preserve">C</w:t>
+            </w:r>
+          </w:p>
+          <w:p>
+            <w:pPr>
+              <w:spacing w:after="0" w:before="0" w:line="260"/>
+            </w:pPr>
+            <w:r>
+              <w:rPr>
+                <w:rFonts w:ascii="Courier New" w:cs="Courier New" w:eastAsia="Courier New" w:hAnsi="Courier New"/>
+                <w:color w:val="1E293B"/>
+                <w:sz w:val="15"/>
+                <w:szCs w:val="15"/>
+              </w:rPr>
+              <w:t xml:space="preserve">C     ARITHMETIC IF FOR SIGN CHECK</w:t>
+            </w:r>
+          </w:p>
+          <w:p>
+            <w:pPr>
+              <w:spacing w:after="0" w:before="0" w:line="260"/>
+            </w:pPr>
+            <w:r>
+              <w:rPr>
+                <w:rFonts w:ascii="Courier New" w:cs="Courier New" w:eastAsia="Courier New" w:hAnsi="Courier New"/>
+                <w:color w:val="1E293B"/>
+                <w:sz w:val="15"/>
+                <w:szCs w:val="15"/>
+              </w:rPr>
+              <w:t xml:space="preserve">      IF (A - B) 10, 20, 30</w:t>
+            </w:r>
+          </w:p>
+          <w:p>
+            <w:pPr>
+              <w:spacing w:after="0" w:before="0" w:line="260"/>
+            </w:pPr>
+            <w:r>
+              <w:rPr>
+                <w:rFonts w:ascii="Courier New" w:cs="Courier New" w:eastAsia="Courier New" w:hAnsi="Courier New"/>
+                <w:color w:val="1E293B"/>
+                <w:sz w:val="15"/>
+                <w:szCs w:val="15"/>
+              </w:rPr>
+              <w:t xml:space="preserve">C</w:t>
+            </w:r>
+          </w:p>
+          <w:p>
+            <w:pPr>
+              <w:spacing w:after="0" w:before="0" w:line="260"/>
+            </w:pPr>
+            <w:r>
+              <w:rPr>
+                <w:rFonts w:ascii="Courier New" w:cs="Courier New" w:eastAsia="Courier New" w:hAnsi="Courier New"/>
+                <w:color w:val="1E293B"/>
+                <w:sz w:val="15"/>
+                <w:szCs w:val="15"/>
+              </w:rPr>
+              <w:t xml:space="preserve">C     COMPUTED GOTO FOR TYPE DISPATCH</w:t>
+            </w:r>
+          </w:p>
+          <w:p>
+            <w:pPr>
+              <w:spacing w:after="0" w:before="0" w:line="260"/>
+            </w:pPr>
+            <w:r>
+              <w:rPr>
+                <w:rFonts w:ascii="Courier New" w:cs="Courier New" w:eastAsia="Courier New" w:hAnsi="Courier New"/>
+                <w:color w:val="1E293B"/>
+                <w:sz w:val="15"/>
+                <w:szCs w:val="15"/>
+              </w:rPr>
+              <w:t xml:space="preserve">   10 GOTO (100, 200, 300, 400), ITYPE</w:t>
+            </w:r>
+          </w:p>
+          <w:p>
+            <w:pPr>
+              <w:spacing w:after="0" w:before="0" w:line="260"/>
+            </w:pPr>
+            <w:r>
+              <w:rPr>
+                <w:rFonts w:ascii="Courier New" w:cs="Courier New" w:eastAsia="Courier New" w:hAnsi="Courier New"/>
+                <w:color w:val="1E293B"/>
+                <w:sz w:val="15"/>
+                <w:szCs w:val="15"/>
+              </w:rPr>
+              <w:t xml:space="preserve">   20 RESULT = 0.0</w:t>
+            </w:r>
+          </w:p>
+          <w:p>
+            <w:pPr>
+              <w:spacing w:after="0" w:before="0" w:line="260"/>
+            </w:pPr>
+            <w:r>
+              <w:rPr>
+                <w:rFonts w:ascii="Courier New" w:cs="Courier New" w:eastAsia="Courier New" w:hAnsi="Courier New"/>
+                <w:color w:val="1E293B"/>
+                <w:sz w:val="15"/>
+                <w:szCs w:val="15"/>
+              </w:rPr>
+              <w:t xml:space="preserve">      RETURN</w:t>
+            </w:r>
+          </w:p>
+          <w:p>
+            <w:pPr>
+              <w:spacing w:after="0" w:before="0" w:line="260"/>
+            </w:pPr>
+            <w:r>
+              <w:rPr>
+                <w:rFonts w:ascii="Courier New" w:cs="Courier New" w:eastAsia="Courier New" w:hAnsi="Courier New"/>
+                <w:color w:val="1E293B"/>
+                <w:sz w:val="15"/>
+                <w:szCs w:val="15"/>
+              </w:rPr>
+              <w:t xml:space="preserve">   30 RESULT = A - B</w:t>
+            </w:r>
+          </w:p>
+          <w:p>
+            <w:pPr>
+              <w:spacing w:after="0" w:before="0" w:line="260"/>
+            </w:pPr>
+            <w:r>
+              <w:rPr>
+                <w:rFonts w:ascii="Courier New" w:cs="Courier New" w:eastAsia="Courier New" w:hAnsi="Courier New"/>
+                <w:color w:val="1E293B"/>
+                <w:sz w:val="15"/>
+                <w:szCs w:val="15"/>
+              </w:rPr>
+              <w:t xml:space="preserve">      RETURN</w:t>
+            </w:r>
+          </w:p>
+          <w:p>
+            <w:pPr>
+              <w:spacing w:after="0" w:before="0" w:line="260"/>
+            </w:pPr>
+            <w:r>
+              <w:rPr>
+                <w:rFonts w:ascii="Courier New" w:cs="Courier New" w:eastAsia="Courier New" w:hAnsi="Courier New"/>
+                <w:color w:val="1E293B"/>
+                <w:sz w:val="15"/>
+                <w:szCs w:val="15"/>
+              </w:rPr>
+              <w:t xml:space="preserve">  100 RESULT = A + B</w:t>
+            </w:r>
+          </w:p>
+          <w:p>
+            <w:pPr>
+              <w:spacing w:after="0" w:before="0" w:line="260"/>
+            </w:pPr>
+            <w:r>
+              <w:rPr>
+                <w:rFonts w:ascii="Courier New" w:cs="Courier New" w:eastAsia="Courier New" w:hAnsi="Courier New"/>
+                <w:color w:val="1E293B"/>
+                <w:sz w:val="15"/>
+                <w:szCs w:val="15"/>
+              </w:rPr>
+              <w:t xml:space="preserve">      RETURN</w:t>
+            </w:r>
+          </w:p>
+          <w:p>
+            <w:pPr>
+              <w:spacing w:after="0" w:before="0" w:line="260"/>
+            </w:pPr>
+            <w:r>
+              <w:rPr>
+                <w:rFonts w:ascii="Courier New" w:cs="Courier New" w:eastAsia="Courier New" w:hAnsi="Courier New"/>
+                <w:color w:val="1E293B"/>
+                <w:sz w:val="15"/>
+                <w:szCs w:val="15"/>
+              </w:rPr>
+              <w:t xml:space="preserve">  200 RESULT = A * B</w:t>
+            </w:r>
+          </w:p>
+          <w:p>
+            <w:pPr>
+              <w:spacing w:after="0" w:before="0" w:line="260"/>
+            </w:pPr>
+            <w:r>
+              <w:rPr>
+                <w:rFonts w:ascii="Courier New" w:cs="Courier New" w:eastAsia="Courier New" w:hAnsi="Courier New"/>
+                <w:color w:val="1E293B"/>
+                <w:sz w:val="15"/>
+                <w:szCs w:val="15"/>
+              </w:rPr>
+              <w:t xml:space="preserve">      RETURN</w:t>
+            </w:r>
+          </w:p>
+          <w:p>
+            <w:pPr>
+              <w:spacing w:after="0" w:before="0" w:line="260"/>
+            </w:pPr>
+            <w:r>
+              <w:rPr>
+                <w:rFonts w:ascii="Courier New" w:cs="Courier New" w:eastAsia="Courier New" w:hAnsi="Courier New"/>
+                <w:color w:val="1E293B"/>
+                <w:sz w:val="15"/>
+                <w:szCs w:val="15"/>
+              </w:rPr>
+              <w:t xml:space="preserve">  300 RESULT = A / B</w:t>
+            </w:r>
+          </w:p>
+          <w:p>
+            <w:pPr>
+              <w:spacing w:after="0" w:before="0" w:line="260"/>
+            </w:pPr>
+            <w:r>
+              <w:rPr>
+                <w:rFonts w:ascii="Courier New" w:cs="Courier New" w:eastAsia="Courier New" w:hAnsi="Courier New"/>
+                <w:color w:val="1E293B"/>
+                <w:sz w:val="15"/>
+                <w:szCs w:val="15"/>
+              </w:rPr>
+              <w:t xml:space="preserve">      RETURN</w:t>
+            </w:r>
+          </w:p>
+          <w:p>
+            <w:pPr>
+              <w:spacing w:after="0" w:before="0" w:line="260"/>
+            </w:pPr>
+            <w:r>
+              <w:rPr>
+                <w:rFonts w:ascii="Courier New" w:cs="Courier New" w:eastAsia="Courier New" w:hAnsi="Courier New"/>
+                <w:color w:val="1E293B"/>
+                <w:sz w:val="15"/>
+                <w:szCs w:val="15"/>
+              </w:rPr>
+              <w:t xml:space="preserve">  400 RESULT = A ** B</w:t>
+            </w:r>
+          </w:p>
+          <w:p>
+            <w:pPr>
+              <w:spacing w:after="0" w:before="0" w:line="260"/>
+            </w:pPr>
+            <w:r>
+              <w:rPr>
+                <w:rFonts w:ascii="Courier New" w:cs="Courier New" w:eastAsia="Courier New" w:hAnsi="Courier New"/>
+                <w:color w:val="1E293B"/>
+                <w:sz w:val="15"/>
+                <w:szCs w:val="15"/>
+              </w:rPr>
+              <w:t xml:space="preserve">      RETURN</w:t>
+            </w:r>
+          </w:p>
+          <w:p>
+            <w:pPr>
+              <w:spacing w:after="0" w:before="0" w:line="260"/>
+            </w:pPr>
+            <w:r>
+              <w:rPr>
+                <w:rFonts w:ascii="Courier New" w:cs="Courier New" w:eastAsia="Courier New" w:hAnsi="Courier New"/>
+                <w:color w:val="1E293B"/>
+                <w:sz w:val="15"/>
+                <w:szCs w:val="15"/>
+              </w:rPr>
+              <w:t xml:space="preserve">      END</w:t>
+            </w:r>
+          </w:p>
+        </w:tc>
+      </w:tr>
+    </w:tbl>
+    <w:p>
+      <w:pPr>
+        <w:spacing w:before="120"/>
+      </w:pPr>
+    </w:p>
+    <w:tbl>
+      <w:tblPr>
+        <w:tblW w:type="dxa" w:w="9360"/>
+        <w:tblBorders>
+          <w:top w:val="single" w:color="auto" w:sz="4"/>
+          <w:left w:val="single" w:color="auto" w:sz="4"/>
+          <w:bottom w:val="single" w:color="auto" w:sz="4"/>
+          <w:right w:val="single" w:color="auto" w:sz="4"/>
+          <w:insideH w:val="single" w:color="auto" w:sz="4"/>
+          <w:insideV w:val="single" w:color="auto" w:sz="4"/>
+        </w:tblBorders>
+      </w:tblPr>
+      <w:tblGrid>
+        <w:gridCol w:w="9360"/>
+      </w:tblGrid>
+      <w:tr>
+        <w:tc>
+          <w:tcPr>
+            <w:tcW w:type="dxa" w:w="9360"/>
+            <w:tcBorders>
+              <w:top w:val="single" w:color="E2E8F0" w:sz="1"/>
+              <w:left w:val="single" w:color="E2E8F0" w:sz="1"/>
+              <w:bottom w:val="none" w:color="FFFFFF" w:sz="0"/>
+              <w:right w:val="single" w:color="E2E8F0" w:sz="1"/>
+            </w:tcBorders>
+            <w:shd w:fill="00A651" w:val="clear"/>
+            <w:tcMar>
+              <w:top w:type="dxa" w:w="40"/>
+              <w:left w:type="dxa" w:w="120"/>
+              <w:bottom w:type="dxa" w:w="40"/>
+              <w:right w:type="dxa" w:w="120"/>
+            </w:tcMar>
+          </w:tcPr>
+          <w:p>
+            <w:r>
+              <w:rPr>
+                <w:rFonts w:ascii="Calibri" w:cs="Calibri" w:eastAsia="Calibri" w:hAnsi="Calibri"/>
+                <w:b/>
+                <w:bCs/>
+                <w:color w:val="FFFFFF"/>
+                <w:sz w:val="16"/>
+                <w:szCs w:val="16"/>
+              </w:rPr>
+              <w:t xml:space="preserve">✔  AFTER — Modern Fortran 2018</w:t>
+            </w:r>
+          </w:p>
+        </w:tc>
+      </w:tr>
+    </w:tbl>
+    <w:tbl>
+      <w:tblPr>
+        <w:tblW w:type="dxa" w:w="9360"/>
+        <w:tblBorders>
+          <w:top w:val="single" w:color="auto" w:sz="4"/>
+          <w:left w:val="single" w:color="auto" w:sz="4"/>
+          <w:bottom w:val="single" w:color="auto" w:sz="4"/>
+          <w:right w:val="single" w:color="auto" w:sz="4"/>
+          <w:insideH w:val="single" w:color="auto" w:sz="4"/>
+          <w:insideV w:val="single" w:color="auto" w:sz="4"/>
+        </w:tblBorders>
+      </w:tblPr>
+      <w:tblGrid>
+        <w:gridCol w:w="9360"/>
+      </w:tblGrid>
+      <w:tr>
+        <w:tc>
+          <w:tcPr>
+            <w:tcW w:type="dxa" w:w="9360"/>
+            <w:tcBorders>
+              <w:top w:val="none" w:color="FFFFFF" w:sz="0"/>
+              <w:left w:val="single" w:color="E2E8F0" w:sz="1"/>
+              <w:bottom w:val="single" w:color="E2E8F0" w:sz="1"/>
+              <w:right w:val="single" w:color="E2E8F0" w:sz="1"/>
+            </w:tcBorders>
+            <w:shd w:fill="F0FFF4" w:val="clear"/>
+            <w:tcMar>
+              <w:top w:type="dxa" w:w="80"/>
+              <w:left w:type="dxa" w:w="160"/>
+              <w:bottom w:type="dxa" w:w="80"/>
+              <w:right w:type="dxa" w:w="160"/>
+            </w:tcMar>
+          </w:tcPr>
+          <w:p>
+            <w:pPr>
+              <w:spacing w:after="0" w:before="0" w:line="260"/>
+            </w:pPr>
+            <w:r>
+              <w:rPr>
+                <w:rFonts w:ascii="Courier New" w:cs="Courier New" w:eastAsia="Courier New" w:hAnsi="Courier New"/>
+                <w:color w:val="1E293B"/>
+                <w:sz w:val="15"/>
+                <w:szCs w:val="15"/>
+              </w:rPr>
+              <w:t xml:space="preserve">module math_dispatch</w:t>
+            </w:r>
+          </w:p>
+          <w:p>
+            <w:pPr>
+              <w:spacing w:after="0" w:before="0" w:line="260"/>
+            </w:pPr>
+            <w:r>
+              <w:rPr>
+                <w:rFonts w:ascii="Courier New" w:cs="Courier New" w:eastAsia="Courier New" w:hAnsi="Courier New"/>
+                <w:color w:val="1E293B"/>
+                <w:sz w:val="15"/>
+                <w:szCs w:val="15"/>
+              </w:rPr>
+              <w:t xml:space="preserve">  implicit none</w:t>
+            </w:r>
+          </w:p>
+          <w:p>
+            <w:pPr>
+              <w:spacing w:after="0" w:before="0" w:line="260"/>
+            </w:pPr>
+            <w:r>
+              <w:rPr>
+                <w:rFonts w:ascii="Courier New" w:cs="Courier New" w:eastAsia="Courier New" w:hAnsi="Courier New"/>
+                <w:color w:val="1E293B"/>
+                <w:sz w:val="15"/>
+                <w:szCs w:val="15"/>
+              </w:rPr>
+              <w:t xml:space="preserve">contains</w:t>
+            </w:r>
+          </w:p>
+          <w:p>
+            <w:pPr>
+              <w:spacing w:after="0" w:before="0" w:line="260"/>
+            </w:pPr>
+            <w:r>
+              <w:rPr>
+                <w:rFonts w:ascii="Courier New" w:cs="Courier New" w:eastAsia="Courier New" w:hAnsi="Courier New"/>
+                <w:color w:val="1E293B"/>
+                <w:sz w:val="15"/>
+                <w:szCs w:val="15"/>
+              </w:rPr>
+              <w:t xml:space="preserve">  subroutine dispatch(itype, a, b, result)</w:t>
+            </w:r>
+          </w:p>
+          <w:p>
+            <w:pPr>
+              <w:spacing w:after="0" w:before="0" w:line="260"/>
+            </w:pPr>
+            <w:r>
+              <w:rPr>
+                <w:rFonts w:ascii="Courier New" w:cs="Courier New" w:eastAsia="Courier New" w:hAnsi="Courier New"/>
+                <w:color w:val="1E293B"/>
+                <w:sz w:val="15"/>
+                <w:szCs w:val="15"/>
+              </w:rPr>
+              <w:t xml:space="preserve">    integer, intent(in)  :: itype</w:t>
+            </w:r>
+          </w:p>
+          <w:p>
+            <w:pPr>
+              <w:spacing w:after="0" w:before="0" w:line="260"/>
+            </w:pPr>
+            <w:r>
+              <w:rPr>
+                <w:rFonts w:ascii="Courier New" w:cs="Courier New" w:eastAsia="Courier New" w:hAnsi="Courier New"/>
+                <w:color w:val="1E293B"/>
+                <w:sz w:val="15"/>
+                <w:szCs w:val="15"/>
+              </w:rPr>
+              <w:t xml:space="preserve">    real,    intent(in)  :: a, b</w:t>
+            </w:r>
+          </w:p>
+          <w:p>
+            <w:pPr>
+              <w:spacing w:after="0" w:before="0" w:line="260"/>
+            </w:pPr>
+            <w:r>
+              <w:rPr>
+                <w:rFonts w:ascii="Courier New" w:cs="Courier New" w:eastAsia="Courier New" w:hAnsi="Courier New"/>
+                <w:color w:val="1E293B"/>
+                <w:sz w:val="15"/>
+                <w:szCs w:val="15"/>
+              </w:rPr>
+              <w:t xml:space="preserve">    real,    intent(out) :: result</w:t>
+            </w:r>
+          </w:p>
+          <w:p>
+            <w:pPr>
+              <w:spacing w:after="0" w:before="0" w:line="260"/>
+            </w:pPr>
+            <w:r>
+              <w:rPr>
+                <w:rFonts w:ascii="Courier New" w:cs="Courier New" w:eastAsia="Courier New" w:hAnsi="Courier New"/>
+                <w:color w:val="1E293B"/>
+                <w:sz w:val="15"/>
+                <w:szCs w:val="15"/>
+              </w:rPr>
+              <w:t xml:space="preserve"> </w:t>
+            </w:r>
+          </w:p>
+          <w:p>
+            <w:pPr>
+              <w:spacing w:after="0" w:before="0" w:line="260"/>
+            </w:pPr>
+            <w:r>
+              <w:rPr>
+                <w:rFonts w:ascii="Courier New" w:cs="Courier New" w:eastAsia="Courier New" w:hAnsi="Courier New"/>
+                <w:color w:val="1E293B"/>
+                <w:sz w:val="15"/>
+                <w:szCs w:val="15"/>
+              </w:rPr>
+              <w:t xml:space="preserve">    if (a &lt; b) then</w:t>
+            </w:r>
+          </w:p>
+          <w:p>
+            <w:pPr>
+              <w:spacing w:after="0" w:before="0" w:line="260"/>
+            </w:pPr>
+            <w:r>
+              <w:rPr>
+                <w:rFonts w:ascii="Courier New" w:cs="Courier New" w:eastAsia="Courier New" w:hAnsi="Courier New"/>
+                <w:color w:val="1E293B"/>
+                <w:sz w:val="15"/>
+                <w:szCs w:val="15"/>
+              </w:rPr>
+              <w:t xml:space="preserve">      select case (itype)</w:t>
+            </w:r>
+          </w:p>
+          <w:p>
+            <w:pPr>
+              <w:spacing w:after="0" w:before="0" w:line="260"/>
+            </w:pPr>
+            <w:r>
+              <w:rPr>
+                <w:rFonts w:ascii="Courier New" w:cs="Courier New" w:eastAsia="Courier New" w:hAnsi="Courier New"/>
+                <w:color w:val="1E293B"/>
+                <w:sz w:val="15"/>
+                <w:szCs w:val="15"/>
+              </w:rPr>
+              <w:t xml:space="preserve">        case (1); result = a + b</w:t>
+            </w:r>
+          </w:p>
+          <w:p>
+            <w:pPr>
+              <w:spacing w:after="0" w:before="0" w:line="260"/>
+            </w:pPr>
+            <w:r>
+              <w:rPr>
+                <w:rFonts w:ascii="Courier New" w:cs="Courier New" w:eastAsia="Courier New" w:hAnsi="Courier New"/>
+                <w:color w:val="1E293B"/>
+                <w:sz w:val="15"/>
+                <w:szCs w:val="15"/>
+              </w:rPr>
+              <w:t xml:space="preserve">        case (2); result = a * b</w:t>
+            </w:r>
+          </w:p>
+          <w:p>
+            <w:pPr>
+              <w:spacing w:after="0" w:before="0" w:line="260"/>
+            </w:pPr>
+            <w:r>
+              <w:rPr>
+                <w:rFonts w:ascii="Courier New" w:cs="Courier New" w:eastAsia="Courier New" w:hAnsi="Courier New"/>
+                <w:color w:val="1E293B"/>
+                <w:sz w:val="15"/>
+                <w:szCs w:val="15"/>
+              </w:rPr>
+              <w:t xml:space="preserve">        case (3); result = a / b</w:t>
+            </w:r>
+          </w:p>
+          <w:p>
+            <w:pPr>
+              <w:spacing w:after="0" w:before="0" w:line="260"/>
+            </w:pPr>
+            <w:r>
+              <w:rPr>
+                <w:rFonts w:ascii="Courier New" w:cs="Courier New" w:eastAsia="Courier New" w:hAnsi="Courier New"/>
+                <w:color w:val="1E293B"/>
+                <w:sz w:val="15"/>
+                <w:szCs w:val="15"/>
+              </w:rPr>
+              <w:t xml:space="preserve">        case (4); result = a ** b</w:t>
+            </w:r>
+          </w:p>
+          <w:p>
+            <w:pPr>
+              <w:spacing w:after="0" w:before="0" w:line="260"/>
+            </w:pPr>
+            <w:r>
+              <w:rPr>
+                <w:rFonts w:ascii="Courier New" w:cs="Courier New" w:eastAsia="Courier New" w:hAnsi="Courier New"/>
+                <w:color w:val="1E293B"/>
+                <w:sz w:val="15"/>
+                <w:szCs w:val="15"/>
+              </w:rPr>
+              <w:t xml:space="preserve">        case default</w:t>
+            </w:r>
+          </w:p>
+          <w:p>
+            <w:pPr>
+              <w:spacing w:after="0" w:before="0" w:line="260"/>
+            </w:pPr>
+            <w:r>
+              <w:rPr>
+                <w:rFonts w:ascii="Courier New" w:cs="Courier New" w:eastAsia="Courier New" w:hAnsi="Courier New"/>
+                <w:color w:val="1E293B"/>
+                <w:sz w:val="15"/>
+                <w:szCs w:val="15"/>
+              </w:rPr>
+              <w:t xml:space="preserve">          result = 0.0</w:t>
+            </w:r>
+          </w:p>
+          <w:p>
+            <w:pPr>
+              <w:spacing w:after="0" w:before="0" w:line="260"/>
+            </w:pPr>
+            <w:r>
+              <w:rPr>
+                <w:rFonts w:ascii="Courier New" w:cs="Courier New" w:eastAsia="Courier New" w:hAnsi="Courier New"/>
+                <w:color w:val="1E293B"/>
+                <w:sz w:val="15"/>
+                <w:szCs w:val="15"/>
+              </w:rPr>
+              <w:t xml:space="preserve">          write(*,*) 'Warning: unknown type', itype</w:t>
+            </w:r>
+          </w:p>
+          <w:p>
+            <w:pPr>
+              <w:spacing w:after="0" w:before="0" w:line="260"/>
+            </w:pPr>
+            <w:r>
+              <w:rPr>
+                <w:rFonts w:ascii="Courier New" w:cs="Courier New" w:eastAsia="Courier New" w:hAnsi="Courier New"/>
+                <w:color w:val="1E293B"/>
+                <w:sz w:val="15"/>
+                <w:szCs w:val="15"/>
+              </w:rPr>
+              <w:t xml:space="preserve">      end select</w:t>
+            </w:r>
+          </w:p>
+          <w:p>
+            <w:pPr>
+              <w:spacing w:after="0" w:before="0" w:line="260"/>
+            </w:pPr>
+            <w:r>
+              <w:rPr>
+                <w:rFonts w:ascii="Courier New" w:cs="Courier New" w:eastAsia="Courier New" w:hAnsi="Courier New"/>
+                <w:color w:val="1E293B"/>
+                <w:sz w:val="15"/>
+                <w:szCs w:val="15"/>
+              </w:rPr>
+              <w:t xml:space="preserve">    else if (a == b) then</w:t>
+            </w:r>
+          </w:p>
+          <w:p>
+            <w:pPr>
+              <w:spacing w:after="0" w:before="0" w:line="260"/>
+            </w:pPr>
+            <w:r>
+              <w:rPr>
+                <w:rFonts w:ascii="Courier New" w:cs="Courier New" w:eastAsia="Courier New" w:hAnsi="Courier New"/>
+                <w:color w:val="1E293B"/>
+                <w:sz w:val="15"/>
+                <w:szCs w:val="15"/>
+              </w:rPr>
+              <w:t xml:space="preserve">      result = 0.0</w:t>
+            </w:r>
+          </w:p>
+          <w:p>
+            <w:pPr>
+              <w:spacing w:after="0" w:before="0" w:line="260"/>
+            </w:pPr>
+            <w:r>
+              <w:rPr>
+                <w:rFonts w:ascii="Courier New" w:cs="Courier New" w:eastAsia="Courier New" w:hAnsi="Courier New"/>
+                <w:color w:val="1E293B"/>
+                <w:sz w:val="15"/>
+                <w:szCs w:val="15"/>
+              </w:rPr>
+              <w:t xml:space="preserve">    else</w:t>
+            </w:r>
+          </w:p>
+          <w:p>
+            <w:pPr>
+              <w:spacing w:after="0" w:before="0" w:line="260"/>
+            </w:pPr>
+            <w:r>
+              <w:rPr>
+                <w:rFonts w:ascii="Courier New" w:cs="Courier New" w:eastAsia="Courier New" w:hAnsi="Courier New"/>
+                <w:color w:val="1E293B"/>
+                <w:sz w:val="15"/>
+                <w:szCs w:val="15"/>
+              </w:rPr>
+              <w:t xml:space="preserve">      result = a - b</w:t>
+            </w:r>
+          </w:p>
+          <w:p>
+            <w:pPr>
+              <w:spacing w:after="0" w:before="0" w:line="260"/>
+            </w:pPr>
+            <w:r>
+              <w:rPr>
+                <w:rFonts w:ascii="Courier New" w:cs="Courier New" w:eastAsia="Courier New" w:hAnsi="Courier New"/>
+                <w:color w:val="1E293B"/>
+                <w:sz w:val="15"/>
+                <w:szCs w:val="15"/>
+              </w:rPr>
+              <w:t xml:space="preserve">    end if</w:t>
+            </w:r>
+          </w:p>
+          <w:p>
+            <w:pPr>
+              <w:spacing w:after="0" w:before="0" w:line="260"/>
+            </w:pPr>
+            <w:r>
+              <w:rPr>
+                <w:rFonts w:ascii="Courier New" w:cs="Courier New" w:eastAsia="Courier New" w:hAnsi="Courier New"/>
+                <w:color w:val="1E293B"/>
+                <w:sz w:val="15"/>
+                <w:szCs w:val="15"/>
+              </w:rPr>
+              <w:t xml:space="preserve">  end subroutine dispatch</w:t>
+            </w:r>
+          </w:p>
+          <w:p>
+            <w:pPr>
+              <w:spacing w:after="0" w:before="0" w:line="260"/>
+            </w:pPr>
+            <w:r>
+              <w:rPr>
+                <w:rFonts w:ascii="Courier New" w:cs="Courier New" w:eastAsia="Courier New" w:hAnsi="Courier New"/>
+                <w:color w:val="1E293B"/>
+                <w:sz w:val="15"/>
+                <w:szCs w:val="15"/>
+              </w:rPr>
+              <w:t xml:space="preserve">end module math_dispatch</w:t>
+            </w:r>
+          </w:p>
+        </w:tc>
+      </w:tr>
+    </w:tbl>
+    <w:p>
+      <w:pPr>
+        <w:spacing w:before="240"/>
+      </w:pPr>
+    </w:p>
+    <w:p>
+      <w:pPr>
+        <w:pStyle w:val="Heading2"/>
+      </w:pPr>
+      <w:r>
+        <w:t xml:space="preserve">Example 5: Fixed-Format with Implicit Typing → Modern Free-Format with Full Type Safety</w:t>
+      </w:r>
+    </w:p>
+    <w:p>
+      <w:pPr>
+        <w:spacing w:after="160"/>
+      </w:pPr>
+      <w:r>
+        <w:rPr>
+          <w:rFonts w:ascii="Calibri" w:cs="Calibri" w:eastAsia="Calibri" w:hAnsi="Calibri"/>
+          <w:i/>
+          <w:iCs/>
+          <w:color w:val="1E293B"/>
+          <w:sz w:val="20"/>
+          <w:szCs w:val="20"/>
+        </w:rPr>
+        <w:t xml:space="preserve">Converts from the 1966-era column-based format to free-format Fortran 2018. Adds IMPLICIT NONE, INTENT attributes, and allocatable arrays for dynamic sizing.</w:t>
+      </w:r>
+    </w:p>
+    <w:tbl>
+      <w:tblPr>
+        <w:tblW w:type="dxa" w:w="9360"/>
+        <w:tblBorders>
+          <w:top w:val="single" w:color="auto" w:sz="4"/>
+          <w:left w:val="single" w:color="auto" w:sz="4"/>
+          <w:bottom w:val="single" w:color="auto" w:sz="4"/>
+          <w:right w:val="single" w:color="auto" w:sz="4"/>
+          <w:insideH w:val="single" w:color="auto" w:sz="4"/>
+          <w:insideV w:val="single" w:color="auto" w:sz="4"/>
+        </w:tblBorders>
+      </w:tblPr>
+      <w:tblGrid>
+        <w:gridCol w:w="9360"/>
+      </w:tblGrid>
+      <w:tr>
+        <w:tc>
+          <w:tcPr>
+            <w:tcW w:type="dxa" w:w="9360"/>
+            <w:tcBorders>
+              <w:top w:val="single" w:color="E2E8F0" w:sz="1"/>
+              <w:left w:val="single" w:color="E2E8F0" w:sz="1"/>
+              <w:bottom w:val="none" w:color="FFFFFF" w:sz="0"/>
+              <w:right w:val="single" w:color="E2E8F0" w:sz="1"/>
+            </w:tcBorders>
+            <w:shd w:fill="DC2626" w:val="clear"/>
+            <w:tcMar>
+              <w:top w:type="dxa" w:w="40"/>
+              <w:left w:type="dxa" w:w="120"/>
+              <w:bottom w:type="dxa" w:w="40"/>
+              <w:right w:type="dxa" w:w="120"/>
+            </w:tcMar>
+          </w:tcPr>
+          <w:p>
+            <w:r>
+              <w:rPr>
+                <w:rFonts w:ascii="Calibri" w:cs="Calibri" w:eastAsia="Calibri" w:hAnsi="Calibri"/>
+                <w:b/>
+                <w:bCs/>
+                <w:color w:val="FFFFFF"/>
+                <w:sz w:val="16"/>
+                <w:szCs w:val="16"/>
+              </w:rPr>
+              <w:t xml:space="preserve">✖  BEFORE — Legacy FORTRAN</w:t>
+            </w:r>
+          </w:p>
+        </w:tc>
+      </w:tr>
+    </w:tbl>
+    <w:tbl>
+      <w:tblPr>
+        <w:tblW w:type="dxa" w:w="9360"/>
+        <w:tblBorders>
+          <w:top w:val="single" w:color="auto" w:sz="4"/>
+          <w:left w:val="single" w:color="auto" w:sz="4"/>
+          <w:bottom w:val="single" w:color="auto" w:sz="4"/>
+          <w:right w:val="single" w:color="auto" w:sz="4"/>
+          <w:insideH w:val="single" w:color="auto" w:sz="4"/>
+          <w:insideV w:val="single" w:color="auto" w:sz="4"/>
+        </w:tblBorders>
+      </w:tblPr>
+      <w:tblGrid>
+        <w:gridCol w:w="9360"/>
+      </w:tblGrid>
+      <w:tr>
+        <w:tc>
+          <w:tcPr>
+            <w:tcW w:type="dxa" w:w="9360"/>
+            <w:tcBorders>
+              <w:top w:val="none" w:color="FFFFFF" w:sz="0"/>
+              <w:left w:val="single" w:color="E2E8F0" w:sz="1"/>
+              <w:bottom w:val="single" w:color="E2E8F0" w:sz="1"/>
+              <w:right w:val="single" w:color="E2E8F0" w:sz="1"/>
+            </w:tcBorders>
+            <w:shd w:fill="FFF5F5" w:val="clear"/>
+            <w:tcMar>
+              <w:top w:type="dxa" w:w="80"/>
+              <w:left w:type="dxa" w:w="160"/>
+              <w:bottom w:type="dxa" w:w="80"/>
+              <w:right w:type="dxa" w:w="160"/>
+            </w:tcMar>
+          </w:tcPr>
+          <w:p>
+            <w:pPr>
+              <w:spacing w:after="0" w:before="0" w:line="260"/>
+            </w:pPr>
+            <w:r>
+              <w:rPr>
+                <w:rFonts w:ascii="Courier New" w:cs="Courier New" w:eastAsia="Courier New" w:hAnsi="Courier New"/>
+                <w:color w:val="1E293B"/>
+                <w:sz w:val="15"/>
+                <w:szCs w:val="15"/>
+              </w:rPr>
+              <w:t xml:space="preserve">C23456789012345678901234567890123456789012345678901234567890123456789012</w:t>
+            </w:r>
+          </w:p>
+          <w:p>
+            <w:pPr>
+              <w:spacing w:after="0" w:before="0" w:line="260"/>
+            </w:pPr>
+            <w:r>
+              <w:rPr>
+                <w:rFonts w:ascii="Courier New" w:cs="Courier New" w:eastAsia="Courier New" w:hAnsi="Courier New"/>
+                <w:color w:val="1E293B"/>
+                <w:sz w:val="15"/>
+                <w:szCs w:val="15"/>
+              </w:rPr>
+              <w:t xml:space="preserve">      SUBROUTINE BLDPK(Z, IZ, MCB, IBUF3)</w:t>
+            </w:r>
+          </w:p>
+          <w:p>
+            <w:pPr>
+              <w:spacing w:after="0" w:before="0" w:line="260"/>
+            </w:pPr>
+            <w:r>
+              <w:rPr>
+                <w:rFonts w:ascii="Courier New" w:cs="Courier New" w:eastAsia="Courier New" w:hAnsi="Courier New"/>
+                <w:color w:val="1E293B"/>
+                <w:sz w:val="15"/>
+                <w:szCs w:val="15"/>
+              </w:rPr>
+              <w:t xml:space="preserve">C     BUILD PACKED MATRIX FROM UNPACKED</w:t>
+            </w:r>
+          </w:p>
+          <w:p>
+            <w:pPr>
+              <w:spacing w:after="0" w:before="0" w:line="260"/>
+            </w:pPr>
+            <w:r>
+              <w:rPr>
+                <w:rFonts w:ascii="Courier New" w:cs="Courier New" w:eastAsia="Courier New" w:hAnsi="Courier New"/>
+                <w:color w:val="1E293B"/>
+                <w:sz w:val="15"/>
+                <w:szCs w:val="15"/>
+              </w:rPr>
+              <w:t xml:space="preserve">      DIMENSION Z(1), IZ(1)</w:t>
+            </w:r>
+          </w:p>
+          <w:p>
+            <w:pPr>
+              <w:spacing w:after="0" w:before="0" w:line="260"/>
+            </w:pPr>
+            <w:r>
+              <w:rPr>
+                <w:rFonts w:ascii="Courier New" w:cs="Courier New" w:eastAsia="Courier New" w:hAnsi="Courier New"/>
+                <w:color w:val="1E293B"/>
+                <w:sz w:val="15"/>
+                <w:szCs w:val="15"/>
+              </w:rPr>
+              <w:t xml:space="preserve">      INTEGER MCB(7)</w:t>
+            </w:r>
+          </w:p>
+          <w:p>
+            <w:pPr>
+              <w:spacing w:after="0" w:before="0" w:line="260"/>
+            </w:pPr>
+            <w:r>
+              <w:rPr>
+                <w:rFonts w:ascii="Courier New" w:cs="Courier New" w:eastAsia="Courier New" w:hAnsi="Courier New"/>
+                <w:color w:val="1E293B"/>
+                <w:sz w:val="15"/>
+                <w:szCs w:val="15"/>
+              </w:rPr>
+              <w:t xml:space="preserve">      NROW = MCB(2)</w:t>
+            </w:r>
+          </w:p>
+          <w:p>
+            <w:pPr>
+              <w:spacing w:after="0" w:before="0" w:line="260"/>
+            </w:pPr>
+            <w:r>
+              <w:rPr>
+                <w:rFonts w:ascii="Courier New" w:cs="Courier New" w:eastAsia="Courier New" w:hAnsi="Courier New"/>
+                <w:color w:val="1E293B"/>
+                <w:sz w:val="15"/>
+                <w:szCs w:val="15"/>
+              </w:rPr>
+              <w:t xml:space="preserve">      NCOL = MCB(3)</w:t>
+            </w:r>
+          </w:p>
+          <w:p>
+            <w:pPr>
+              <w:spacing w:after="0" w:before="0" w:line="260"/>
+            </w:pPr>
+            <w:r>
+              <w:rPr>
+                <w:rFonts w:ascii="Courier New" w:cs="Courier New" w:eastAsia="Courier New" w:hAnsi="Courier New"/>
+                <w:color w:val="1E293B"/>
+                <w:sz w:val="15"/>
+                <w:szCs w:val="15"/>
+              </w:rPr>
+              <w:t xml:space="preserve">      DO 200 J = 1, NCOL</w:t>
+            </w:r>
+          </w:p>
+          <w:p>
+            <w:pPr>
+              <w:spacing w:after="0" w:before="0" w:line="260"/>
+            </w:pPr>
+            <w:r>
+              <w:rPr>
+                <w:rFonts w:ascii="Courier New" w:cs="Courier New" w:eastAsia="Courier New" w:hAnsi="Courier New"/>
+                <w:color w:val="1E293B"/>
+                <w:sz w:val="15"/>
+                <w:szCs w:val="15"/>
+              </w:rPr>
+              <w:t xml:space="preserve">        DO 100 I = 1, NROW</w:t>
+            </w:r>
+          </w:p>
+          <w:p>
+            <w:pPr>
+              <w:spacing w:after="0" w:before="0" w:line="260"/>
+            </w:pPr>
+            <w:r>
+              <w:rPr>
+                <w:rFonts w:ascii="Courier New" w:cs="Courier New" w:eastAsia="Courier New" w:hAnsi="Courier New"/>
+                <w:color w:val="1E293B"/>
+                <w:sz w:val="15"/>
+                <w:szCs w:val="15"/>
+              </w:rPr>
+              <w:t xml:space="preserve">          IF (Z(I + (J-1)*NROW) .NE. 0.0) THEN</w:t>
+            </w:r>
+          </w:p>
+          <w:p>
+            <w:pPr>
+              <w:spacing w:after="0" w:before="0" w:line="260"/>
+            </w:pPr>
+            <w:r>
+              <w:rPr>
+                <w:rFonts w:ascii="Courier New" w:cs="Courier New" w:eastAsia="Courier New" w:hAnsi="Courier New"/>
+                <w:color w:val="1E293B"/>
+                <w:sz w:val="15"/>
+                <w:szCs w:val="15"/>
+              </w:rPr>
+              <w:t xml:space="preserve">            IZ(IBUF3) = I</w:t>
+            </w:r>
+          </w:p>
+          <w:p>
+            <w:pPr>
+              <w:spacing w:after="0" w:before="0" w:line="260"/>
+            </w:pPr>
+            <w:r>
+              <w:rPr>
+                <w:rFonts w:ascii="Courier New" w:cs="Courier New" w:eastAsia="Courier New" w:hAnsi="Courier New"/>
+                <w:color w:val="1E293B"/>
+                <w:sz w:val="15"/>
+                <w:szCs w:val="15"/>
+              </w:rPr>
+              <w:t xml:space="preserve">            Z(IBUF3+1) = Z(I + (J-1)*NROW)</w:t>
+            </w:r>
+          </w:p>
+          <w:p>
+            <w:pPr>
+              <w:spacing w:after="0" w:before="0" w:line="260"/>
+            </w:pPr>
+            <w:r>
+              <w:rPr>
+                <w:rFonts w:ascii="Courier New" w:cs="Courier New" w:eastAsia="Courier New" w:hAnsi="Courier New"/>
+                <w:color w:val="1E293B"/>
+                <w:sz w:val="15"/>
+                <w:szCs w:val="15"/>
+              </w:rPr>
+              <w:t xml:space="preserve">            IBUF3 = IBUF3 + 2</w:t>
+            </w:r>
+          </w:p>
+          <w:p>
+            <w:pPr>
+              <w:spacing w:after="0" w:before="0" w:line="260"/>
+            </w:pPr>
+            <w:r>
+              <w:rPr>
+                <w:rFonts w:ascii="Courier New" w:cs="Courier New" w:eastAsia="Courier New" w:hAnsi="Courier New"/>
+                <w:color w:val="1E293B"/>
+                <w:sz w:val="15"/>
+                <w:szCs w:val="15"/>
+              </w:rPr>
+              <w:t xml:space="preserve">          ENDIF</w:t>
+            </w:r>
+          </w:p>
+          <w:p>
+            <w:pPr>
+              <w:spacing w:after="0" w:before="0" w:line="260"/>
+            </w:pPr>
+            <w:r>
+              <w:rPr>
+                <w:rFonts w:ascii="Courier New" w:cs="Courier New" w:eastAsia="Courier New" w:hAnsi="Courier New"/>
+                <w:color w:val="1E293B"/>
+                <w:sz w:val="15"/>
+                <w:szCs w:val="15"/>
+              </w:rPr>
+              <w:t xml:space="preserve">  100   CONTINUE</w:t>
+            </w:r>
+          </w:p>
+          <w:p>
+            <w:pPr>
+              <w:spacing w:after="0" w:before="0" w:line="260"/>
+            </w:pPr>
+            <w:r>
+              <w:rPr>
+                <w:rFonts w:ascii="Courier New" w:cs="Courier New" w:eastAsia="Courier New" w:hAnsi="Courier New"/>
+                <w:color w:val="1E293B"/>
+                <w:sz w:val="15"/>
+                <w:szCs w:val="15"/>
+              </w:rPr>
+              <w:t xml:space="preserve">  200 CONTINUE</w:t>
+            </w:r>
+          </w:p>
+          <w:p>
+            <w:pPr>
+              <w:spacing w:after="0" w:before="0" w:line="260"/>
+            </w:pPr>
+            <w:r>
+              <w:rPr>
+                <w:rFonts w:ascii="Courier New" w:cs="Courier New" w:eastAsia="Courier New" w:hAnsi="Courier New"/>
+                <w:color w:val="1E293B"/>
+                <w:sz w:val="15"/>
+                <w:szCs w:val="15"/>
+              </w:rPr>
+              <w:t xml:space="preserve">      RETURN</w:t>
+            </w:r>
+          </w:p>
+          <w:p>
+            <w:pPr>
+              <w:spacing w:after="0" w:before="0" w:line="260"/>
+            </w:pPr>
+            <w:r>
+              <w:rPr>
+                <w:rFonts w:ascii="Courier New" w:cs="Courier New" w:eastAsia="Courier New" w:hAnsi="Courier New"/>
+                <w:color w:val="1E293B"/>
+                <w:sz w:val="15"/>
+                <w:szCs w:val="15"/>
+              </w:rPr>
+              <w:t xml:space="preserve">      END</w:t>
+            </w:r>
+          </w:p>
+        </w:tc>
+      </w:tr>
+    </w:tbl>
+    <w:p>
+      <w:pPr>
+        <w:spacing w:before="120"/>
+      </w:pPr>
+    </w:p>
+    <w:tbl>
+      <w:tblPr>
+        <w:tblW w:type="dxa" w:w="9360"/>
+        <w:tblBorders>
+          <w:top w:val="single" w:color="auto" w:sz="4"/>
+          <w:left w:val="single" w:color="auto" w:sz="4"/>
+          <w:bottom w:val="single" w:color="auto" w:sz="4"/>
+          <w:right w:val="single" w:color="auto" w:sz="4"/>
+          <w:insideH w:val="single" w:color="auto" w:sz="4"/>
+          <w:insideV w:val="single" w:color="auto" w:sz="4"/>
+        </w:tblBorders>
+      </w:tblPr>
+      <w:tblGrid>
+        <w:gridCol w:w="9360"/>
+      </w:tblGrid>
+      <w:tr>
+        <w:tc>
+          <w:tcPr>
+            <w:tcW w:type="dxa" w:w="9360"/>
+            <w:tcBorders>
+              <w:top w:val="single" w:color="E2E8F0" w:sz="1"/>
+              <w:left w:val="single" w:color="E2E8F0" w:sz="1"/>
+              <w:bottom w:val="none" w:color="FFFFFF" w:sz="0"/>
+              <w:right w:val="single" w:color="E2E8F0" w:sz="1"/>
+            </w:tcBorders>
+            <w:shd w:fill="00A651" w:val="clear"/>
+            <w:tcMar>
+              <w:top w:type="dxa" w:w="40"/>
+              <w:left w:type="dxa" w:w="120"/>
+              <w:bottom w:type="dxa" w:w="40"/>
+              <w:right w:type="dxa" w:w="120"/>
+            </w:tcMar>
+          </w:tcPr>
+          <w:p>
+            <w:r>
+              <w:rPr>
+                <w:rFonts w:ascii="Calibri" w:cs="Calibri" w:eastAsia="Calibri" w:hAnsi="Calibri"/>
+                <w:b/>
+                <w:bCs/>
+                <w:color w:val="FFFFFF"/>
+                <w:sz w:val="16"/>
+                <w:szCs w:val="16"/>
+              </w:rPr>
+              <w:t xml:space="preserve">✔  AFTER — Modern Fortran 2018</w:t>
+            </w:r>
+          </w:p>
+        </w:tc>
+      </w:tr>
+    </w:tbl>
+    <w:tbl>
+      <w:tblPr>
+        <w:tblW w:type="dxa" w:w="9360"/>
+        <w:tblBorders>
+          <w:top w:val="single" w:color="auto" w:sz="4"/>
+          <w:left w:val="single" w:color="auto" w:sz="4"/>
+          <w:bottom w:val="single" w:color="auto" w:sz="4"/>
+          <w:right w:val="single" w:color="auto" w:sz="4"/>
+          <w:insideH w:val="single" w:color="auto" w:sz="4"/>
+          <w:insideV w:val="single" w:color="auto" w:sz="4"/>
+        </w:tblBorders>
+      </w:tblPr>
+      <w:tblGrid>
+        <w:gridCol w:w="9360"/>
+      </w:tblGrid>
+      <w:tr>
+        <w:tc>
+          <w:tcPr>
+            <w:tcW w:type="dxa" w:w="9360"/>
+            <w:tcBorders>
+              <w:top w:val="none" w:color="FFFFFF" w:sz="0"/>
+              <w:left w:val="single" w:color="E2E8F0" w:sz="1"/>
+              <w:bottom w:val="single" w:color="E2E8F0" w:sz="1"/>
+              <w:right w:val="single" w:color="E2E8F0" w:sz="1"/>
+            </w:tcBorders>
+            <w:shd w:fill="F0FFF4" w:val="clear"/>
+            <w:tcMar>
+              <w:top w:type="dxa" w:w="80"/>
+              <w:left w:type="dxa" w:w="160"/>
+              <w:bottom w:type="dxa" w:w="80"/>
+              <w:right w:type="dxa" w:w="160"/>
+            </w:tcMar>
+          </w:tcPr>
+          <w:p>
+            <w:pPr>
+              <w:spacing w:after="0" w:before="0" w:line="260"/>
+            </w:pPr>
+            <w:r>
+              <w:rPr>
+                <w:rFonts w:ascii="Courier New" w:cs="Courier New" w:eastAsia="Courier New" w:hAnsi="Courier New"/>
+                <w:color w:val="1E293B"/>
+                <w:sz w:val="15"/>
+                <w:szCs w:val="15"/>
+              </w:rPr>
+              <w:t xml:space="preserve">module matrix_builder</w:t>
+            </w:r>
+          </w:p>
+          <w:p>
+            <w:pPr>
+              <w:spacing w:after="0" w:before="0" w:line="260"/>
+            </w:pPr>
+            <w:r>
+              <w:rPr>
+                <w:rFonts w:ascii="Courier New" w:cs="Courier New" w:eastAsia="Courier New" w:hAnsi="Courier New"/>
+                <w:color w:val="1E293B"/>
+                <w:sz w:val="15"/>
+                <w:szCs w:val="15"/>
+              </w:rPr>
+              <w:t xml:space="preserve">  use iso_fortran_env, only: real64, int32</w:t>
+            </w:r>
+          </w:p>
+          <w:p>
+            <w:pPr>
+              <w:spacing w:after="0" w:before="0" w:line="260"/>
+            </w:pPr>
+            <w:r>
+              <w:rPr>
+                <w:rFonts w:ascii="Courier New" w:cs="Courier New" w:eastAsia="Courier New" w:hAnsi="Courier New"/>
+                <w:color w:val="1E293B"/>
+                <w:sz w:val="15"/>
+                <w:szCs w:val="15"/>
+              </w:rPr>
+              <w:t xml:space="preserve">  implicit none</w:t>
+            </w:r>
+          </w:p>
+          <w:p>
+            <w:pPr>
+              <w:spacing w:after="0" w:before="0" w:line="260"/>
+            </w:pPr>
+            <w:r>
+              <w:rPr>
+                <w:rFonts w:ascii="Courier New" w:cs="Courier New" w:eastAsia="Courier New" w:hAnsi="Courier New"/>
+                <w:color w:val="1E293B"/>
+                <w:sz w:val="15"/>
+                <w:szCs w:val="15"/>
+              </w:rPr>
+              <w:t xml:space="preserve">  private</w:t>
+            </w:r>
+          </w:p>
+          <w:p>
+            <w:pPr>
+              <w:spacing w:after="0" w:before="0" w:line="260"/>
+            </w:pPr>
+            <w:r>
+              <w:rPr>
+                <w:rFonts w:ascii="Courier New" w:cs="Courier New" w:eastAsia="Courier New" w:hAnsi="Courier New"/>
+                <w:color w:val="1E293B"/>
+                <w:sz w:val="15"/>
+                <w:szCs w:val="15"/>
+              </w:rPr>
+              <w:t xml:space="preserve">  public :: build_packed</w:t>
+            </w:r>
+          </w:p>
+          <w:p>
+            <w:pPr>
+              <w:spacing w:after="0" w:before="0" w:line="260"/>
+            </w:pPr>
+            <w:r>
+              <w:rPr>
+                <w:rFonts w:ascii="Courier New" w:cs="Courier New" w:eastAsia="Courier New" w:hAnsi="Courier New"/>
+                <w:color w:val="1E293B"/>
+                <w:sz w:val="15"/>
+                <w:szCs w:val="15"/>
+              </w:rPr>
+              <w:t xml:space="preserve"> </w:t>
+            </w:r>
+          </w:p>
+          <w:p>
+            <w:pPr>
+              <w:spacing w:after="0" w:before="0" w:line="260"/>
+            </w:pPr>
+            <w:r>
+              <w:rPr>
+                <w:rFonts w:ascii="Courier New" w:cs="Courier New" w:eastAsia="Courier New" w:hAnsi="Courier New"/>
+                <w:color w:val="1E293B"/>
+                <w:sz w:val="15"/>
+                <w:szCs w:val="15"/>
+              </w:rPr>
+              <w:t xml:space="preserve">  type :: sparse_entry</w:t>
+            </w:r>
+          </w:p>
+          <w:p>
+            <w:pPr>
+              <w:spacing w:after="0" w:before="0" w:line="260"/>
+            </w:pPr>
+            <w:r>
+              <w:rPr>
+                <w:rFonts w:ascii="Courier New" w:cs="Courier New" w:eastAsia="Courier New" w:hAnsi="Courier New"/>
+                <w:color w:val="1E293B"/>
+                <w:sz w:val="15"/>
+                <w:szCs w:val="15"/>
+              </w:rPr>
+              <w:t xml:space="preserve">    integer(int32) :: row</w:t>
+            </w:r>
+          </w:p>
+          <w:p>
+            <w:pPr>
+              <w:spacing w:after="0" w:before="0" w:line="260"/>
+            </w:pPr>
+            <w:r>
+              <w:rPr>
+                <w:rFonts w:ascii="Courier New" w:cs="Courier New" w:eastAsia="Courier New" w:hAnsi="Courier New"/>
+                <w:color w:val="1E293B"/>
+                <w:sz w:val="15"/>
+                <w:szCs w:val="15"/>
+              </w:rPr>
+              <w:t xml:space="preserve">    real(real64)   :: value</w:t>
+            </w:r>
+          </w:p>
+          <w:p>
+            <w:pPr>
+              <w:spacing w:after="0" w:before="0" w:line="260"/>
+            </w:pPr>
+            <w:r>
+              <w:rPr>
+                <w:rFonts w:ascii="Courier New" w:cs="Courier New" w:eastAsia="Courier New" w:hAnsi="Courier New"/>
+                <w:color w:val="1E293B"/>
+                <w:sz w:val="15"/>
+                <w:szCs w:val="15"/>
+              </w:rPr>
+              <w:t xml:space="preserve">  end type sparse_entry</w:t>
+            </w:r>
+          </w:p>
+          <w:p>
+            <w:pPr>
+              <w:spacing w:after="0" w:before="0" w:line="260"/>
+            </w:pPr>
+            <w:r>
+              <w:rPr>
+                <w:rFonts w:ascii="Courier New" w:cs="Courier New" w:eastAsia="Courier New" w:hAnsi="Courier New"/>
+                <w:color w:val="1E293B"/>
+                <w:sz w:val="15"/>
+                <w:szCs w:val="15"/>
+              </w:rPr>
+              <w:t xml:space="preserve"> </w:t>
+            </w:r>
+          </w:p>
+          <w:p>
+            <w:pPr>
+              <w:spacing w:after="0" w:before="0" w:line="260"/>
+            </w:pPr>
+            <w:r>
+              <w:rPr>
+                <w:rFonts w:ascii="Courier New" w:cs="Courier New" w:eastAsia="Courier New" w:hAnsi="Courier New"/>
+                <w:color w:val="1E293B"/>
+                <w:sz w:val="15"/>
+                <w:szCs w:val="15"/>
+              </w:rPr>
+              <w:t xml:space="preserve">contains</w:t>
+            </w:r>
+          </w:p>
+          <w:p>
+            <w:pPr>
+              <w:spacing w:after="0" w:before="0" w:line="260"/>
+            </w:pPr>
+            <w:r>
+              <w:rPr>
+                <w:rFonts w:ascii="Courier New" w:cs="Courier New" w:eastAsia="Courier New" w:hAnsi="Courier New"/>
+                <w:color w:val="1E293B"/>
+                <w:sz w:val="15"/>
+                <w:szCs w:val="15"/>
+              </w:rPr>
+              <w:t xml:space="preserve">  subroutine build_packed(matrix, nrow, ncol, packed, nnz)</w:t>
+            </w:r>
+          </w:p>
+          <w:p>
+            <w:pPr>
+              <w:spacing w:after="0" w:before="0" w:line="260"/>
+            </w:pPr>
+            <w:r>
+              <w:rPr>
+                <w:rFonts w:ascii="Courier New" w:cs="Courier New" w:eastAsia="Courier New" w:hAnsi="Courier New"/>
+                <w:color w:val="1E293B"/>
+                <w:sz w:val="15"/>
+                <w:szCs w:val="15"/>
+              </w:rPr>
+              <w:t xml:space="preserve">    real(real64), intent(in)               :: matrix(:,:)</w:t>
+            </w:r>
+          </w:p>
+          <w:p>
+            <w:pPr>
+              <w:spacing w:after="0" w:before="0" w:line="260"/>
+            </w:pPr>
+            <w:r>
+              <w:rPr>
+                <w:rFonts w:ascii="Courier New" w:cs="Courier New" w:eastAsia="Courier New" w:hAnsi="Courier New"/>
+                <w:color w:val="1E293B"/>
+                <w:sz w:val="15"/>
+                <w:szCs w:val="15"/>
+              </w:rPr>
+              <w:t xml:space="preserve">    integer,      intent(in)               :: nrow, ncol</w:t>
+            </w:r>
+          </w:p>
+          <w:p>
+            <w:pPr>
+              <w:spacing w:after="0" w:before="0" w:line="260"/>
+            </w:pPr>
+            <w:r>
+              <w:rPr>
+                <w:rFonts w:ascii="Courier New" w:cs="Courier New" w:eastAsia="Courier New" w:hAnsi="Courier New"/>
+                <w:color w:val="1E293B"/>
+                <w:sz w:val="15"/>
+                <w:szCs w:val="15"/>
+              </w:rPr>
+              <w:t xml:space="preserve">    type(sparse_entry), allocatable, intent(out) :: packed(:)</w:t>
+            </w:r>
+          </w:p>
+          <w:p>
+            <w:pPr>
+              <w:spacing w:after="0" w:before="0" w:line="260"/>
+            </w:pPr>
+            <w:r>
+              <w:rPr>
+                <w:rFonts w:ascii="Courier New" w:cs="Courier New" w:eastAsia="Courier New" w:hAnsi="Courier New"/>
+                <w:color w:val="1E293B"/>
+                <w:sz w:val="15"/>
+                <w:szCs w:val="15"/>
+              </w:rPr>
+              <w:t xml:space="preserve">    integer,      intent(out)              :: nnz</w:t>
+            </w:r>
+          </w:p>
+          <w:p>
+            <w:pPr>
+              <w:spacing w:after="0" w:before="0" w:line="260"/>
+            </w:pPr>
+            <w:r>
+              <w:rPr>
+                <w:rFonts w:ascii="Courier New" w:cs="Courier New" w:eastAsia="Courier New" w:hAnsi="Courier New"/>
+                <w:color w:val="1E293B"/>
+                <w:sz w:val="15"/>
+                <w:szCs w:val="15"/>
+              </w:rPr>
+              <w:t xml:space="preserve">    integer :: i, j, k</w:t>
+            </w:r>
+          </w:p>
+          <w:p>
+            <w:pPr>
+              <w:spacing w:after="0" w:before="0" w:line="260"/>
+            </w:pPr>
+            <w:r>
+              <w:rPr>
+                <w:rFonts w:ascii="Courier New" w:cs="Courier New" w:eastAsia="Courier New" w:hAnsi="Courier New"/>
+                <w:color w:val="1E293B"/>
+                <w:sz w:val="15"/>
+                <w:szCs w:val="15"/>
+              </w:rPr>
+              <w:t xml:space="preserve">    type(sparse_entry) :: temp(nrow * ncol)</w:t>
+            </w:r>
+          </w:p>
+          <w:p>
+            <w:pPr>
+              <w:spacing w:after="0" w:before="0" w:line="260"/>
+            </w:pPr>
+            <w:r>
+              <w:rPr>
+                <w:rFonts w:ascii="Courier New" w:cs="Courier New" w:eastAsia="Courier New" w:hAnsi="Courier New"/>
+                <w:color w:val="1E293B"/>
+                <w:sz w:val="15"/>
+                <w:szCs w:val="15"/>
+              </w:rPr>
+              <w:t xml:space="preserve"> </w:t>
+            </w:r>
+          </w:p>
+          <w:p>
+            <w:pPr>
+              <w:spacing w:after="0" w:before="0" w:line="260"/>
+            </w:pPr>
+            <w:r>
+              <w:rPr>
+                <w:rFonts w:ascii="Courier New" w:cs="Courier New" w:eastAsia="Courier New" w:hAnsi="Courier New"/>
+                <w:color w:val="1E293B"/>
+                <w:sz w:val="15"/>
+                <w:szCs w:val="15"/>
+              </w:rPr>
+              <w:t xml:space="preserve">    k = 0</w:t>
+            </w:r>
+          </w:p>
+          <w:p>
+            <w:pPr>
+              <w:spacing w:after="0" w:before="0" w:line="260"/>
+            </w:pPr>
+            <w:r>
+              <w:rPr>
+                <w:rFonts w:ascii="Courier New" w:cs="Courier New" w:eastAsia="Courier New" w:hAnsi="Courier New"/>
+                <w:color w:val="1E293B"/>
+                <w:sz w:val="15"/>
+                <w:szCs w:val="15"/>
+              </w:rPr>
+              <w:t xml:space="preserve">    do j = 1, ncol</w:t>
+            </w:r>
+          </w:p>
+          <w:p>
+            <w:pPr>
+              <w:spacing w:after="0" w:before="0" w:line="260"/>
+            </w:pPr>
+            <w:r>
+              <w:rPr>
+                <w:rFonts w:ascii="Courier New" w:cs="Courier New" w:eastAsia="Courier New" w:hAnsi="Courier New"/>
+                <w:color w:val="1E293B"/>
+                <w:sz w:val="15"/>
+                <w:szCs w:val="15"/>
+              </w:rPr>
+              <w:t xml:space="preserve">      do i = 1, nrow</w:t>
+            </w:r>
+          </w:p>
+          <w:p>
+            <w:pPr>
+              <w:spacing w:after="0" w:before="0" w:line="260"/>
+            </w:pPr>
+            <w:r>
+              <w:rPr>
+                <w:rFonts w:ascii="Courier New" w:cs="Courier New" w:eastAsia="Courier New" w:hAnsi="Courier New"/>
+                <w:color w:val="1E293B"/>
+                <w:sz w:val="15"/>
+                <w:szCs w:val="15"/>
+              </w:rPr>
+              <w:t xml:space="preserve">        if (matrix(i,j) /= 0.0_real64) then</w:t>
+            </w:r>
+          </w:p>
+          <w:p>
+            <w:pPr>
+              <w:spacing w:after="0" w:before="0" w:line="260"/>
+            </w:pPr>
+            <w:r>
+              <w:rPr>
+                <w:rFonts w:ascii="Courier New" w:cs="Courier New" w:eastAsia="Courier New" w:hAnsi="Courier New"/>
+                <w:color w:val="1E293B"/>
+                <w:sz w:val="15"/>
+                <w:szCs w:val="15"/>
+              </w:rPr>
+              <w:t xml:space="preserve">          k = k + 1</w:t>
+            </w:r>
+          </w:p>
+          <w:p>
+            <w:pPr>
+              <w:spacing w:after="0" w:before="0" w:line="260"/>
+            </w:pPr>
+            <w:r>
+              <w:rPr>
+                <w:rFonts w:ascii="Courier New" w:cs="Courier New" w:eastAsia="Courier New" w:hAnsi="Courier New"/>
+                <w:color w:val="1E293B"/>
+                <w:sz w:val="15"/>
+                <w:szCs w:val="15"/>
+              </w:rPr>
+              <w:t xml:space="preserve">          temp(k) = sparse_entry(i, matrix(i,j))</w:t>
+            </w:r>
+          </w:p>
+          <w:p>
+            <w:pPr>
+              <w:spacing w:after="0" w:before="0" w:line="260"/>
+            </w:pPr>
+            <w:r>
+              <w:rPr>
+                <w:rFonts w:ascii="Courier New" w:cs="Courier New" w:eastAsia="Courier New" w:hAnsi="Courier New"/>
+                <w:color w:val="1E293B"/>
+                <w:sz w:val="15"/>
+                <w:szCs w:val="15"/>
+              </w:rPr>
+              <w:t xml:space="preserve">        end if</w:t>
+            </w:r>
+          </w:p>
+          <w:p>
+            <w:pPr>
+              <w:spacing w:after="0" w:before="0" w:line="260"/>
+            </w:pPr>
+            <w:r>
+              <w:rPr>
+                <w:rFonts w:ascii="Courier New" w:cs="Courier New" w:eastAsia="Courier New" w:hAnsi="Courier New"/>
+                <w:color w:val="1E293B"/>
+                <w:sz w:val="15"/>
+                <w:szCs w:val="15"/>
+              </w:rPr>
+              <w:t xml:space="preserve">      end do</w:t>
+            </w:r>
+          </w:p>
+          <w:p>
+            <w:pPr>
+              <w:spacing w:after="0" w:before="0" w:line="260"/>
+            </w:pPr>
+            <w:r>
+              <w:rPr>
+                <w:rFonts w:ascii="Courier New" w:cs="Courier New" w:eastAsia="Courier New" w:hAnsi="Courier New"/>
+                <w:color w:val="1E293B"/>
+                <w:sz w:val="15"/>
+                <w:szCs w:val="15"/>
+              </w:rPr>
+              <w:t xml:space="preserve">    end do</w:t>
+            </w:r>
+          </w:p>
+          <w:p>
+            <w:pPr>
+              <w:spacing w:after="0" w:before="0" w:line="260"/>
+            </w:pPr>
+            <w:r>
+              <w:rPr>
+                <w:rFonts w:ascii="Courier New" w:cs="Courier New" w:eastAsia="Courier New" w:hAnsi="Courier New"/>
+                <w:color w:val="1E293B"/>
+                <w:sz w:val="15"/>
+                <w:szCs w:val="15"/>
+              </w:rPr>
+              <w:t xml:space="preserve">    nnz = k</w:t>
+            </w:r>
+          </w:p>
+          <w:p>
+            <w:pPr>
+              <w:spacing w:after="0" w:before="0" w:line="260"/>
+            </w:pPr>
+            <w:r>
+              <w:rPr>
+                <w:rFonts w:ascii="Courier New" w:cs="Courier New" w:eastAsia="Courier New" w:hAnsi="Courier New"/>
+                <w:color w:val="1E293B"/>
+                <w:sz w:val="15"/>
+                <w:szCs w:val="15"/>
+              </w:rPr>
+              <w:t xml:space="preserve">    allocate(packed(nnz))</w:t>
+            </w:r>
+          </w:p>
+          <w:p>
+            <w:pPr>
+              <w:spacing w:after="0" w:before="0" w:line="260"/>
+            </w:pPr>
+            <w:r>
+              <w:rPr>
+                <w:rFonts w:ascii="Courier New" w:cs="Courier New" w:eastAsia="Courier New" w:hAnsi="Courier New"/>
+                <w:color w:val="1E293B"/>
+                <w:sz w:val="15"/>
+                <w:szCs w:val="15"/>
+              </w:rPr>
+              <w:t xml:space="preserve">    packed(1:nnz) = temp(1:nnz)</w:t>
+            </w:r>
+          </w:p>
+          <w:p>
+            <w:pPr>
+              <w:spacing w:after="0" w:before="0" w:line="260"/>
+            </w:pPr>
+            <w:r>
+              <w:rPr>
+                <w:rFonts w:ascii="Courier New" w:cs="Courier New" w:eastAsia="Courier New" w:hAnsi="Courier New"/>
+                <w:color w:val="1E293B"/>
+                <w:sz w:val="15"/>
+                <w:szCs w:val="15"/>
+              </w:rPr>
+              <w:t xml:space="preserve">  end subroutine build_packed</w:t>
+            </w:r>
+          </w:p>
+          <w:p>
+            <w:pPr>
+              <w:spacing w:after="0" w:before="0" w:line="260"/>
+            </w:pPr>
+            <w:r>
+              <w:rPr>
+                <w:rFonts w:ascii="Courier New" w:cs="Courier New" w:eastAsia="Courier New" w:hAnsi="Courier New"/>
+                <w:color w:val="1E293B"/>
+                <w:sz w:val="15"/>
+                <w:szCs w:val="15"/>
+              </w:rPr>
+              <w:t xml:space="preserve">end module matrix_builder</w:t>
+            </w:r>
+          </w:p>
+        </w:tc>
+      </w:tr>
+    </w:tbl>
+    <w:p>
+      <w:pPr>
+        <w:spacing w:before="240"/>
+      </w:pPr>
     </w:p>
     <w:p>
       <w:pPr>

</xml_diff>